<commit_message>
Fix swapped CAN pin assignments in reference doc
The schematic shows CAN_TX on GPIO25 and CAN_RX on GPIO27; the doc had
them reversed, which matched neither the board nor the working sketch.

Co-Authored-By: Claude Fable 5 <noreply@anthropic.com>
</commit_message>
<xml_diff>
--- a/AngryPixieDash_Reference.docx
+++ b/AngryPixieDash_Reference.docx
@@ -29,37 +29,19 @@
           <w:sz w:val="26"/>
           <w:szCs w:val="26"/>
         </w:rPr>
-        <w:t xml:space="preserve">EV Dashboard · Porsche 928 / Nissan Leaf Stack / </w:t>
-      </w:r>
-      <w:proofErr w:type="spellStart"/>
-      <w:r>
-        <w:rPr>
-          <w:color w:val="2E75B6"/>
-          <w:sz w:val="26"/>
-          <w:szCs w:val="26"/>
-        </w:rPr>
-        <w:t>ZombieVerter</w:t>
-      </w:r>
-      <w:proofErr w:type="spellEnd"/>
+        <w:t>EV Dashboard · Porsche 928 / Nissan Leaf Stack / ZombieVerter</w:t>
+      </w:r>
     </w:p>
     <w:p>
       <w:pPr>
         <w:spacing w:after="80"/>
         <w:jc w:val="center"/>
       </w:pPr>
-      <w:proofErr w:type="spellStart"/>
       <w:r>
         <w:rPr>
           <w:color w:val="606060"/>
         </w:rPr>
-        <w:t>Uniboard</w:t>
-      </w:r>
-      <w:proofErr w:type="spellEnd"/>
-      <w:r>
-        <w:rPr>
-          <w:color w:val="606060"/>
-        </w:rPr>
-        <w:t xml:space="preserve"> PCB · Wiring · Configuration · Code Reference</w:t>
+        <w:t>Uniboard PCB · Wiring · Configuration · Code Reference</w:t>
       </w:r>
     </w:p>
     <w:p>
@@ -75,29 +57,7 @@
           <w:sz w:val="18"/>
           <w:szCs w:val="18"/>
         </w:rPr>
-        <w:t xml:space="preserve">Rev 1.0 · </w:t>
-      </w:r>
-      <w:proofErr w:type="spellStart"/>
-      <w:r>
-        <w:rPr>
-          <w:i/>
-          <w:iCs/>
-          <w:color w:val="909090"/>
-          <w:sz w:val="18"/>
-          <w:szCs w:val="18"/>
-        </w:rPr>
-        <w:t>EasyEDA</w:t>
-      </w:r>
-      <w:proofErr w:type="spellEnd"/>
-      <w:r>
-        <w:rPr>
-          <w:i/>
-          <w:iCs/>
-          <w:color w:val="909090"/>
-          <w:sz w:val="18"/>
-          <w:szCs w:val="18"/>
-        </w:rPr>
-        <w:t xml:space="preserve"> · Designed by Sayantan98</w:t>
+        <w:t>Rev 1.0 · EasyEDA · Designed by Sayantan98</w:t>
       </w:r>
     </w:p>
     <w:p>
@@ -105,15 +65,7 @@
         <w:pStyle w:val="Heading1"/>
       </w:pPr>
       <w:r>
-        <w:t>1</w:t>
-      </w:r>
-      <w:proofErr w:type="gramStart"/>
-      <w:r>
-        <w:t>.  System</w:t>
-      </w:r>
-      <w:proofErr w:type="gramEnd"/>
-      <w:r>
-        <w:t xml:space="preserve"> Overview</w:t>
+        <w:t>1.  System Overview</w:t>
       </w:r>
     </w:p>
     <w:p>
@@ -124,61 +76,19 @@
         <w:rPr>
           <w:color w:val="000000"/>
         </w:rPr>
-        <w:t xml:space="preserve">The Angry Pixie Dash is a self-contained EV dashboard built around the Angry Pixie Garage </w:t>
-      </w:r>
-      <w:proofErr w:type="spellStart"/>
+        <w:t>The Angry Pixie Dash is a self-contained EV dashboard built around the Angry Pixie Garage Uniboard. The board integrates an ESP32-WROOM-32E module, SN65HVD230 CAN transceiver, 4-channel relay outputs, 5V buck converter, USB-C programming port, level-shifted GPIO outputs, and an optocoupler input — all on a single PCB designed to mount directly in the vehicle.</w:t>
+      </w:r>
+    </w:p>
+    <w:p/>
+    <w:p>
+      <w:pPr>
+        <w:spacing w:after="120"/>
+      </w:pPr>
       <w:r>
         <w:rPr>
           <w:color w:val="000000"/>
         </w:rPr>
-        <w:t>Uniboard</w:t>
-      </w:r>
-      <w:proofErr w:type="spellEnd"/>
-      <w:r>
-        <w:rPr>
-          <w:color w:val="000000"/>
-        </w:rPr>
-        <w:t>. The board integrates an ESP32-WROOM-32E module, SN65HVD230 CAN transceiver, 4-channel relay outputs, 5V buck converter, USB-C programming port, level-shifted GPIO outputs, and an optocoupler input — all on a single PCB designed to mount directly in the vehicle.</w:t>
-      </w:r>
-    </w:p>
-    <w:p/>
-    <w:p>
-      <w:pPr>
-        <w:spacing w:after="120"/>
-      </w:pPr>
-      <w:r>
-        <w:rPr>
-          <w:color w:val="000000"/>
-        </w:rPr>
-        <w:t xml:space="preserve">The firmware reads native Nissan Leaf CAN1 frames directly from the </w:t>
-      </w:r>
-      <w:proofErr w:type="spellStart"/>
-      <w:r>
-        <w:rPr>
-          <w:color w:val="000000"/>
-        </w:rPr>
-        <w:t>ZombieVerter</w:t>
-      </w:r>
-      <w:proofErr w:type="spellEnd"/>
-      <w:r>
-        <w:rPr>
-          <w:color w:val="000000"/>
-        </w:rPr>
-        <w:t xml:space="preserve"> CAN1 bus and serves a live web dashboard over a built-in </w:t>
-      </w:r>
-      <w:proofErr w:type="spellStart"/>
-      <w:r>
-        <w:rPr>
-          <w:color w:val="000000"/>
-        </w:rPr>
-        <w:t>WiFi</w:t>
-      </w:r>
-      <w:proofErr w:type="spellEnd"/>
-      <w:r>
-        <w:rPr>
-          <w:color w:val="000000"/>
-        </w:rPr>
-        <w:t xml:space="preserve"> access point. No external router or internet connection is required.</w:t>
+        <w:t>The firmware reads native Nissan Leaf CAN1 frames directly from the ZombieVerter CAN1 bus and serves a live web dashboard over a built-in WiFi access point. No external router or internet connection is required.</w:t>
       </w:r>
     </w:p>
     <w:p/>
@@ -203,21 +113,29 @@
         <w:rPr>
           <w:color w:val="000000"/>
         </w:rPr>
-        <w:t xml:space="preserve">•  Microcontroller: ESP32-WROOM-32E, dual-core 240MHz, 4MB flash, </w:t>
-      </w:r>
-      <w:proofErr w:type="spellStart"/>
+        <w:t>•  Microcontroller: ESP32-WROOM-32E, dual-core 240MHz, 4MB flash, WiFi + BLE</w:t>
+      </w:r>
+    </w:p>
+    <w:p>
+      <w:pPr>
+        <w:spacing w:after="120"/>
+      </w:pPr>
       <w:r>
         <w:rPr>
           <w:color w:val="000000"/>
         </w:rPr>
-        <w:t>WiFi</w:t>
-      </w:r>
-      <w:proofErr w:type="spellEnd"/>
+        <w:t>•  CAN: SN65HVD230DR transceiver, 500 kbps, ISO 11898-2, onboard switchable termination</w:t>
+      </w:r>
+    </w:p>
+    <w:p>
+      <w:pPr>
+        <w:spacing w:after="120"/>
+      </w:pPr>
       <w:r>
         <w:rPr>
           <w:color w:val="000000"/>
         </w:rPr>
-        <w:t xml:space="preserve"> + BLE</w:t>
+        <w:t>•  Power input: 9–28V DC via CN4 (24V nominal), onboard 15A fuse, AP63205WU-7 buck to 5V</w:t>
       </w:r>
     </w:p>
     <w:p>
@@ -228,7 +146,7 @@
         <w:rPr>
           <w:color w:val="000000"/>
         </w:rPr>
-        <w:t>•  CAN: SN65HVD230DR transceiver, 500 kbps, ISO 11898-2, onboard switchable termination</w:t>
+        <w:t>•  Relay outputs: 4× SRD-5VDC-SL-A SPDT, 10A contacts, NO outputs on CN1</w:t>
       </w:r>
     </w:p>
     <w:p>
@@ -239,7 +157,7 @@
         <w:rPr>
           <w:color w:val="000000"/>
         </w:rPr>
-        <w:t>•  Power input: 9–28V DC via CN4 (24V nominal), onboard 15A fuse, AP63205WU-7 buck to 5V</w:t>
+        <w:t>•  Level-shifted outputs: GPIO21, GPIO23, GPIO33 available at 5V logic level</w:t>
       </w:r>
     </w:p>
     <w:p>
@@ -250,7 +168,7 @@
         <w:rPr>
           <w:color w:val="000000"/>
         </w:rPr>
-        <w:t>•  Relay outputs: 4× SRD-5VDC-SL-A SPDT, 10A contacts, NO outputs on CN1</w:t>
+        <w:t>•  Programming: USB-C via CH340C (auto-reset circuit included)</w:t>
       </w:r>
     </w:p>
     <w:p>
@@ -261,7 +179,7 @@
         <w:rPr>
           <w:color w:val="000000"/>
         </w:rPr>
-        <w:t>•  Level-shifted outputs: GPIO21, GPIO23, GPIO33 available at 5V logic level</w:t>
+        <w:t>•  WiFi: ESP32 soft AP — SSID: ESP32-EV-Dashboard, Password: evdash1234</w:t>
       </w:r>
     </w:p>
     <w:p>
@@ -272,7 +190,24 @@
         <w:rPr>
           <w:color w:val="000000"/>
         </w:rPr>
-        <w:t>•  Programming: USB-C via CH340C (auto-reset circuit included)</w:t>
+        <w:t>•  Web interface: http://192.168.4.1  (Driver View + Diagnostics pages)</w:t>
+      </w:r>
+    </w:p>
+    <w:p/>
+    <w:p>
+      <w:pPr>
+        <w:pStyle w:val="Heading1"/>
+      </w:pPr>
+      <w:r>
+        <w:t>2.  Uniboard PCB</w:t>
+      </w:r>
+    </w:p>
+    <w:p>
+      <w:pPr>
+        <w:pStyle w:val="Heading2"/>
+      </w:pPr>
+      <w:r>
+        <w:t>2.1  Board Overview</w:t>
       </w:r>
     </w:p>
     <w:p>
@@ -283,21 +218,30 @@
         <w:rPr>
           <w:color w:val="000000"/>
         </w:rPr>
-        <w:t xml:space="preserve">•  </w:t>
-      </w:r>
-      <w:proofErr w:type="spellStart"/>
+        <w:t>The Uniboard is a two-layer PCB with all components on the top side. Mounting holes are provided at four corners. The board is divided into functional zones visible in the PCB render:</w:t>
+      </w:r>
+    </w:p>
+    <w:p/>
+    <w:p>
+      <w:pPr>
+        <w:spacing w:after="120"/>
+      </w:pPr>
       <w:r>
         <w:rPr>
           <w:color w:val="000000"/>
         </w:rPr>
-        <w:t>WiFi</w:t>
-      </w:r>
-      <w:proofErr w:type="spellEnd"/>
+        <w:t>•  Top-left: relay cluster (K1-K4) with flyback diodes and transistor drivers</w:t>
+      </w:r>
+    </w:p>
+    <w:p>
+      <w:pPr>
+        <w:spacing w:after="120"/>
+      </w:pPr>
       <w:r>
         <w:rPr>
           <w:color w:val="000000"/>
         </w:rPr>
-        <w:t>: ESP32 soft AP — SSID: ESP32-EV-Dashboard, Password: evdash1234</w:t>
+        <w:t>•  Top-centre/right: JST XH output connectors (CN1-CN7)</w:t>
       </w:r>
     </w:p>
     <w:p>
@@ -308,56 +252,60 @@
         <w:rPr>
           <w:color w:val="000000"/>
         </w:rPr>
-        <w:t xml:space="preserve">•  Web interface: </w:t>
-      </w:r>
-      <w:proofErr w:type="gramStart"/>
+        <w:t>•  Centre: ESP32-WROOM-32E module with GPIO header breakouts H1 and H2</w:t>
+      </w:r>
+    </w:p>
+    <w:p>
+      <w:pPr>
+        <w:spacing w:after="120"/>
+      </w:pPr>
       <w:r>
         <w:rPr>
           <w:color w:val="000000"/>
         </w:rPr>
-        <w:t>http://192.168.4.1  (</w:t>
-      </w:r>
-      <w:proofErr w:type="gramEnd"/>
+        <w:t>•  Centre-left: USB-C connector, CH340C, auto-reset circuit, RST/BOOT buttons</w:t>
+      </w:r>
+    </w:p>
+    <w:p>
+      <w:pPr>
+        <w:spacing w:after="120"/>
+      </w:pPr>
       <w:r>
         <w:rPr>
           <w:color w:val="000000"/>
         </w:rPr>
-        <w:t>Driver View + Diagnostics pages)</w:t>
+        <w:t>•  Centre-right: SN65HVD230 CAN transceiver, level shifters, termination jumpers</w:t>
+      </w:r>
+    </w:p>
+    <w:p>
+      <w:pPr>
+        <w:spacing w:after="120"/>
+      </w:pPr>
+      <w:r>
+        <w:rPr>
+          <w:color w:val="000000"/>
+        </w:rPr>
+        <w:t>•  Bottom-left: 24V input connector CN4 with fuse FH1 and AP63205WU-7 buck converter</w:t>
+      </w:r>
+    </w:p>
+    <w:p>
+      <w:pPr>
+        <w:spacing w:after="120"/>
+      </w:pPr>
+      <w:r>
+        <w:rPr>
+          <w:color w:val="000000"/>
+        </w:rPr>
+        <w:t>•  Bottom-centre: power indicator LED</w:t>
       </w:r>
     </w:p>
     <w:p/>
     <w:p>
       <w:pPr>
-        <w:pStyle w:val="Heading1"/>
-      </w:pPr>
-      <w:r>
-        <w:t>2</w:t>
-      </w:r>
-      <w:proofErr w:type="gramStart"/>
-      <w:r>
-        <w:t xml:space="preserve">.  </w:t>
-      </w:r>
-      <w:proofErr w:type="spellStart"/>
-      <w:r>
-        <w:t>Uniboard</w:t>
-      </w:r>
-      <w:proofErr w:type="spellEnd"/>
-      <w:proofErr w:type="gramEnd"/>
-      <w:r>
-        <w:t xml:space="preserve"> PCB</w:t>
-      </w:r>
-    </w:p>
-    <w:p>
-      <w:pPr>
         <w:pStyle w:val="Heading2"/>
       </w:pPr>
-      <w:proofErr w:type="gramStart"/>
-      <w:r>
-        <w:t>2.1  Board</w:t>
-      </w:r>
-      <w:proofErr w:type="gramEnd"/>
-      <w:r>
-        <w:t xml:space="preserve"> Overview</w:t>
+      <w:r>
+        <w:t>2.2  Bill of Materials</w:t>
       </w:r>
     </w:p>
     <w:p>
@@ -368,166 +316,7 @@
         <w:rPr>
           <w:color w:val="000000"/>
         </w:rPr>
-        <w:t xml:space="preserve">The </w:t>
-      </w:r>
-      <w:proofErr w:type="spellStart"/>
-      <w:r>
-        <w:rPr>
-          <w:color w:val="000000"/>
-        </w:rPr>
-        <w:t>Uniboard</w:t>
-      </w:r>
-      <w:proofErr w:type="spellEnd"/>
-      <w:r>
-        <w:rPr>
-          <w:color w:val="000000"/>
-        </w:rPr>
-        <w:t xml:space="preserve"> is a two-layer PCB with all components on the top side. Mounting holes are provided at four corners. The board is divided into functional zones visible in the PCB render:</w:t>
-      </w:r>
-    </w:p>
-    <w:p/>
-    <w:p>
-      <w:pPr>
-        <w:spacing w:after="120"/>
-      </w:pPr>
-      <w:r>
-        <w:rPr>
-          <w:color w:val="000000"/>
-        </w:rPr>
-        <w:t>•  Top-left: relay cluster (K1-K4) with flyback diodes and transistor drivers</w:t>
-      </w:r>
-    </w:p>
-    <w:p>
-      <w:pPr>
-        <w:spacing w:after="120"/>
-      </w:pPr>
-      <w:r>
-        <w:rPr>
-          <w:color w:val="000000"/>
-        </w:rPr>
-        <w:t>•  Top-</w:t>
-      </w:r>
-      <w:proofErr w:type="spellStart"/>
-      <w:r>
-        <w:rPr>
-          <w:color w:val="000000"/>
-        </w:rPr>
-        <w:t>centre</w:t>
-      </w:r>
-      <w:proofErr w:type="spellEnd"/>
-      <w:r>
-        <w:rPr>
-          <w:color w:val="000000"/>
-        </w:rPr>
-        <w:t>/right: JST XH output connectors (CN1-CN7)</w:t>
-      </w:r>
-    </w:p>
-    <w:p>
-      <w:pPr>
-        <w:spacing w:after="120"/>
-      </w:pPr>
-      <w:r>
-        <w:rPr>
-          <w:color w:val="000000"/>
-        </w:rPr>
-        <w:t>•  Centre: ESP32-WROOM-32E module with GPIO header breakouts H1 and H2</w:t>
-      </w:r>
-    </w:p>
-    <w:p>
-      <w:pPr>
-        <w:spacing w:after="120"/>
-      </w:pPr>
-      <w:r>
-        <w:rPr>
-          <w:color w:val="000000"/>
-        </w:rPr>
-        <w:t>•  Centre-left: USB-C connector, CH340C, auto-reset circuit, RST/BOOT buttons</w:t>
-      </w:r>
-    </w:p>
-    <w:p>
-      <w:pPr>
-        <w:spacing w:after="120"/>
-      </w:pPr>
-      <w:r>
-        <w:rPr>
-          <w:color w:val="000000"/>
-        </w:rPr>
-        <w:t>•  Centre-right: SN65HVD230 CAN transceiver, level shifters, termination jumpers</w:t>
-      </w:r>
-    </w:p>
-    <w:p>
-      <w:pPr>
-        <w:spacing w:after="120"/>
-      </w:pPr>
-      <w:r>
-        <w:rPr>
-          <w:color w:val="000000"/>
-        </w:rPr>
-        <w:t>•  Bottom-left: 24V input connector CN4 with fuse FH1 and AP63205WU-7 buck converter</w:t>
-      </w:r>
-    </w:p>
-    <w:p>
-      <w:pPr>
-        <w:spacing w:after="120"/>
-      </w:pPr>
-      <w:r>
-        <w:rPr>
-          <w:color w:val="000000"/>
-        </w:rPr>
-        <w:t>•  Bottom-</w:t>
-      </w:r>
-      <w:proofErr w:type="spellStart"/>
-      <w:r>
-        <w:rPr>
-          <w:color w:val="000000"/>
-        </w:rPr>
-        <w:t>centre</w:t>
-      </w:r>
-      <w:proofErr w:type="spellEnd"/>
-      <w:r>
-        <w:rPr>
-          <w:color w:val="000000"/>
-        </w:rPr>
-        <w:t>: power indicator LED</w:t>
-      </w:r>
-    </w:p>
-    <w:p/>
-    <w:p>
-      <w:pPr>
-        <w:pStyle w:val="Heading2"/>
-      </w:pPr>
-      <w:proofErr w:type="gramStart"/>
-      <w:r>
-        <w:t>2.2  Bill</w:t>
-      </w:r>
-      <w:proofErr w:type="gramEnd"/>
-      <w:r>
-        <w:t xml:space="preserve"> of Materials</w:t>
-      </w:r>
-    </w:p>
-    <w:p>
-      <w:pPr>
-        <w:spacing w:after="120"/>
-      </w:pPr>
-      <w:r>
-        <w:rPr>
-          <w:color w:val="000000"/>
-        </w:rPr>
-        <w:t xml:space="preserve">All components </w:t>
-      </w:r>
-      <w:proofErr w:type="gramStart"/>
-      <w:r>
-        <w:rPr>
-          <w:color w:val="000000"/>
-        </w:rPr>
-        <w:t>sourced</w:t>
-      </w:r>
-      <w:proofErr w:type="gramEnd"/>
-      <w:r>
-        <w:rPr>
-          <w:color w:val="000000"/>
-        </w:rPr>
-        <w:t xml:space="preserve"> from LCSC. Key ICs and their roles:</w:t>
+        <w:t>All components sourced from LCSC. Key ICs and their roles:</w:t>
       </w:r>
     </w:p>
     <w:p/>
@@ -797,25 +586,7 @@
                 <w:sz w:val="20"/>
                 <w:szCs w:val="20"/>
               </w:rPr>
-              <w:t xml:space="preserve">Main microcontroller — </w:t>
-            </w:r>
-            <w:proofErr w:type="spellStart"/>
-            <w:r>
-              <w:rPr>
-                <w:color w:val="000000"/>
-                <w:sz w:val="20"/>
-                <w:szCs w:val="20"/>
-              </w:rPr>
-              <w:t>WiFi</w:t>
-            </w:r>
-            <w:proofErr w:type="spellEnd"/>
-            <w:r>
-              <w:rPr>
-                <w:color w:val="000000"/>
-                <w:sz w:val="20"/>
-                <w:szCs w:val="20"/>
-              </w:rPr>
-              <w:t>, BLE, dual-core 240MHz, 4MB flash</w:t>
+              <w:t>Main microcontroller — WiFi, BLE, dual-core 240MHz, 4MB flash</w:t>
             </w:r>
           </w:p>
         </w:tc>
@@ -2651,25 +2422,7 @@
                 <w:sz w:val="20"/>
                 <w:szCs w:val="20"/>
               </w:rPr>
-              <w:t>JP</w:t>
-            </w:r>
-            <w:proofErr w:type="gramStart"/>
-            <w:r>
-              <w:rPr>
-                <w:color w:val="000000"/>
-                <w:sz w:val="20"/>
-                <w:szCs w:val="20"/>
-              </w:rPr>
-              <w:t>1,JP</w:t>
-            </w:r>
-            <w:proofErr w:type="gramEnd"/>
-            <w:r>
-              <w:rPr>
-                <w:color w:val="000000"/>
-                <w:sz w:val="20"/>
-                <w:szCs w:val="20"/>
-              </w:rPr>
-              <w:t>2</w:t>
+              <w:t>JP1,JP2</w:t>
             </w:r>
           </w:p>
         </w:tc>
@@ -3509,25 +3262,7 @@
                 <w:sz w:val="20"/>
                 <w:szCs w:val="20"/>
               </w:rPr>
-              <w:t>H</w:t>
-            </w:r>
-            <w:proofErr w:type="gramStart"/>
-            <w:r>
-              <w:rPr>
-                <w:color w:val="000000"/>
-                <w:sz w:val="20"/>
-                <w:szCs w:val="20"/>
-              </w:rPr>
-              <w:t>1,H</w:t>
-            </w:r>
-            <w:proofErr w:type="gramEnd"/>
-            <w:r>
-              <w:rPr>
-                <w:color w:val="000000"/>
-                <w:sz w:val="20"/>
-                <w:szCs w:val="20"/>
-              </w:rPr>
-              <w:t>2</w:t>
+              <w:t>H1,H2</w:t>
             </w:r>
           </w:p>
         </w:tc>
@@ -3622,13 +3357,8 @@
       <w:pPr>
         <w:pStyle w:val="Heading2"/>
       </w:pPr>
-      <w:proofErr w:type="gramStart"/>
-      <w:r>
-        <w:t>2.3  Connector</w:t>
-      </w:r>
-      <w:proofErr w:type="gramEnd"/>
-      <w:r>
-        <w:t xml:space="preserve"> Reference</w:t>
+      <w:r>
+        <w:t>2.3  Connector Reference</w:t>
       </w:r>
     </w:p>
     <w:p>
@@ -4404,25 +4134,7 @@
                 <w:sz w:val="20"/>
                 <w:szCs w:val="20"/>
               </w:rPr>
-              <w:t xml:space="preserve">Pin1=CANH, Pin2=CANL. Connect to </w:t>
-            </w:r>
-            <w:proofErr w:type="spellStart"/>
-            <w:r>
-              <w:rPr>
-                <w:color w:val="000000"/>
-                <w:sz w:val="20"/>
-                <w:szCs w:val="20"/>
-              </w:rPr>
-              <w:t>ZombieVerter</w:t>
-            </w:r>
-            <w:proofErr w:type="spellEnd"/>
-            <w:r>
-              <w:rPr>
-                <w:color w:val="000000"/>
-                <w:sz w:val="20"/>
-                <w:szCs w:val="20"/>
-              </w:rPr>
-              <w:t xml:space="preserve"> CAN1. Onboard 120Ω termination selectable via JP1/JP2.</w:t>
+              <w:t>Pin1=CANH, Pin2=CANL. Connect to ZombieVerter CAN1. Onboard 120Ω termination selectable via JP1/JP2.</w:t>
             </w:r>
           </w:p>
         </w:tc>
@@ -4782,25 +4494,7 @@
                 <w:sz w:val="20"/>
                 <w:szCs w:val="20"/>
               </w:rPr>
-              <w:t xml:space="preserve">CH340C USB-UART bridge. </w:t>
-            </w:r>
-            <w:proofErr w:type="gramStart"/>
-            <w:r>
-              <w:rPr>
-                <w:color w:val="000000"/>
-                <w:sz w:val="20"/>
-                <w:szCs w:val="20"/>
-              </w:rPr>
-              <w:t>Use for</w:t>
-            </w:r>
-            <w:proofErr w:type="gramEnd"/>
-            <w:r>
-              <w:rPr>
-                <w:color w:val="000000"/>
-                <w:sz w:val="20"/>
-                <w:szCs w:val="20"/>
-              </w:rPr>
-              <w:t xml:space="preserve"> firmware upload and serial monitor. Can also power board at 5V for bench use (bypasses buck converter).</w:t>
+              <w:t>CH340C USB-UART bridge. Use for firmware upload and serial monitor. Can also power board at 5V for bench use (bypasses buck converter).</w:t>
             </w:r>
           </w:p>
         </w:tc>
@@ -5051,7 +4745,6 @@
       <w:pPr>
         <w:spacing w:after="120"/>
       </w:pPr>
-      <w:proofErr w:type="gramStart"/>
       <w:r>
         <w:rPr>
           <w:b/>
@@ -5060,18 +4753,7 @@
           <w:sz w:val="20"/>
           <w:szCs w:val="20"/>
         </w:rPr>
-        <w:t>⚠  CN</w:t>
-      </w:r>
-      <w:proofErr w:type="gramEnd"/>
-      <w:r>
-        <w:rPr>
-          <w:b/>
-          <w:bCs/>
-          <w:color w:val="C00000"/>
-          <w:sz w:val="20"/>
-          <w:szCs w:val="20"/>
-        </w:rPr>
-        <w:t>4 is the main 24V power input. Always connect via a fuse — the onboard PTF-15 fuse holder FH1 takes a standard 15A automotive blade fuse. Do not exceed 28V input.</w:t>
+        <w:t>⚠  CN4 is the main 24V power input. Always connect via a fuse — the onboard PTF-15 fuse holder FH1 takes a standard 15A automotive blade fuse. Do not exceed 28V input.</w:t>
       </w:r>
     </w:p>
     <w:p/>
@@ -5080,15 +4762,7 @@
         <w:pStyle w:val="Heading1"/>
       </w:pPr>
       <w:r>
-        <w:t>3</w:t>
-      </w:r>
-      <w:proofErr w:type="gramStart"/>
-      <w:r>
-        <w:t>.  Power</w:t>
-      </w:r>
-      <w:proofErr w:type="gramEnd"/>
-      <w:r>
-        <w:t xml:space="preserve"> System</w:t>
+        <w:t>3.  Power System</w:t>
       </w:r>
     </w:p>
     <w:p>
@@ -5099,35 +4773,7 @@
         <w:rPr>
           <w:color w:val="000000"/>
         </w:rPr>
-        <w:t xml:space="preserve">The </w:t>
-      </w:r>
-      <w:proofErr w:type="spellStart"/>
-      <w:r>
-        <w:rPr>
-          <w:color w:val="000000"/>
-        </w:rPr>
-        <w:t>Uniboard</w:t>
-      </w:r>
-      <w:proofErr w:type="spellEnd"/>
-      <w:r>
-        <w:rPr>
-          <w:color w:val="000000"/>
-        </w:rPr>
-        <w:t xml:space="preserve"> has </w:t>
-      </w:r>
-      <w:proofErr w:type="gramStart"/>
-      <w:r>
-        <w:rPr>
-          <w:color w:val="000000"/>
-        </w:rPr>
-        <w:t>a dual</w:t>
-      </w:r>
-      <w:proofErr w:type="gramEnd"/>
-      <w:r>
-        <w:rPr>
-          <w:color w:val="000000"/>
-        </w:rPr>
-        <w:t>-path power architecture. In vehicle use, 24V is supplied via CN4. On the bench, USB-C powers the logic via VUSB.</w:t>
+        <w:t>The Uniboard has a dual-path power architecture. In vehicle use, 24V is supplied via CN4. On the bench, USB-C powers the logic via VUSB.</w:t>
       </w:r>
     </w:p>
     <w:p/>
@@ -5615,43 +5261,7 @@
                 <w:sz w:val="20"/>
                 <w:szCs w:val="20"/>
               </w:rPr>
-              <w:t xml:space="preserve">5V from USB. Schottky diode prevents </w:t>
-            </w:r>
-            <w:proofErr w:type="spellStart"/>
-            <w:r>
-              <w:rPr>
-                <w:color w:val="000000"/>
-                <w:sz w:val="20"/>
-                <w:szCs w:val="20"/>
-              </w:rPr>
-              <w:t>backfeed</w:t>
-            </w:r>
-            <w:proofErr w:type="spellEnd"/>
-            <w:r>
-              <w:rPr>
-                <w:color w:val="000000"/>
-                <w:sz w:val="20"/>
-                <w:szCs w:val="20"/>
-              </w:rPr>
-              <w:t xml:space="preserve"> when 24V supply </w:t>
-            </w:r>
-            <w:proofErr w:type="gramStart"/>
-            <w:r>
-              <w:rPr>
-                <w:color w:val="000000"/>
-                <w:sz w:val="20"/>
-                <w:szCs w:val="20"/>
-              </w:rPr>
-              <w:t>also</w:t>
-            </w:r>
-            <w:proofErr w:type="gramEnd"/>
-            <w:r>
-              <w:rPr>
-                <w:color w:val="000000"/>
-                <w:sz w:val="20"/>
-                <w:szCs w:val="20"/>
-              </w:rPr>
-              <w:t xml:space="preserve"> present. Powers CH340C independently.</w:t>
+              <w:t>5V from USB. Schottky diode prevents backfeed when 24V supply also present. Powers CH340C independently.</w:t>
             </w:r>
           </w:p>
         </w:tc>
@@ -5674,7 +5284,6 @@
       <w:pPr>
         <w:spacing w:after="120"/>
       </w:pPr>
-      <w:proofErr w:type="gramStart"/>
       <w:r>
         <w:rPr>
           <w:b/>
@@ -5683,40 +5292,7 @@
           <w:sz w:val="20"/>
           <w:szCs w:val="20"/>
         </w:rPr>
-        <w:t>⚠  The</w:t>
-      </w:r>
-      <w:proofErr w:type="gramEnd"/>
-      <w:r>
-        <w:rPr>
-          <w:b/>
-          <w:bCs/>
-          <w:color w:val="C00000"/>
-          <w:sz w:val="20"/>
-          <w:szCs w:val="20"/>
-        </w:rPr>
-        <w:t xml:space="preserve"> vehicle supply should be switched via the </w:t>
-      </w:r>
-      <w:proofErr w:type="spellStart"/>
-      <w:r>
-        <w:rPr>
-          <w:b/>
-          <w:bCs/>
-          <w:color w:val="C00000"/>
-          <w:sz w:val="20"/>
-          <w:szCs w:val="20"/>
-        </w:rPr>
-        <w:t>ZombieVerter</w:t>
-      </w:r>
-      <w:proofErr w:type="spellEnd"/>
-      <w:r>
-        <w:rPr>
-          <w:b/>
-          <w:bCs/>
-          <w:color w:val="C00000"/>
-          <w:sz w:val="20"/>
-          <w:szCs w:val="20"/>
-        </w:rPr>
-        <w:t xml:space="preserve"> run-mode contactor or a dedicated run-mode output so the dashboard powers off when the inverter shuts down. This prevents parasitic 12V drain when parked.</w:t>
+        <w:t>⚠  The vehicle supply should be switched via the ZombieVerter run-mode contactor or a dedicated run-mode output so the dashboard powers off when the inverter shuts down. This prevents parasitic 12V drain when parked.</w:t>
       </w:r>
     </w:p>
     <w:p/>
@@ -5725,15 +5301,7 @@
         <w:pStyle w:val="Heading1"/>
       </w:pPr>
       <w:r>
-        <w:t>4</w:t>
-      </w:r>
-      <w:proofErr w:type="gramStart"/>
-      <w:r>
-        <w:t>.  CAN</w:t>
-      </w:r>
-      <w:proofErr w:type="gramEnd"/>
-      <w:r>
-        <w:t xml:space="preserve"> Bus Interface</w:t>
+        <w:t>4.  CAN Bus Interface</w:t>
       </w:r>
     </w:p>
     <w:tbl>
@@ -5884,25 +5452,7 @@
                 <w:sz w:val="20"/>
                 <w:szCs w:val="20"/>
               </w:rPr>
-              <w:t xml:space="preserve">SN65HVD230DR (Texas </w:t>
-            </w:r>
-            <w:proofErr w:type="gramStart"/>
-            <w:r>
-              <w:rPr>
-                <w:color w:val="000000"/>
-                <w:sz w:val="20"/>
-                <w:szCs w:val="20"/>
-              </w:rPr>
-              <w:t>Instruments) —</w:t>
-            </w:r>
-            <w:proofErr w:type="gramEnd"/>
-            <w:r>
-              <w:rPr>
-                <w:color w:val="000000"/>
-                <w:sz w:val="20"/>
-                <w:szCs w:val="20"/>
-              </w:rPr>
-              <w:t xml:space="preserve"> 3.3V, 1Mbps max, ISO 11898-2 compliant</w:t>
+              <w:t>SN65HVD230DR (Texas Instruments) — 3.3V, 1Mbps max, ISO 11898-2 compliant</w:t>
             </w:r>
           </w:p>
         </w:tc>
@@ -5966,25 +5516,7 @@
                 <w:sz w:val="20"/>
                 <w:szCs w:val="20"/>
               </w:rPr>
-              <w:t xml:space="preserve">CAN_TX → GPIO27 (ESP32 IO27 / TWAI </w:t>
-            </w:r>
-            <w:proofErr w:type="gramStart"/>
-            <w:r>
-              <w:rPr>
-                <w:color w:val="000000"/>
-                <w:sz w:val="20"/>
-                <w:szCs w:val="20"/>
-              </w:rPr>
-              <w:t>TX)  |</w:t>
-            </w:r>
-            <w:proofErr w:type="gramEnd"/>
-            <w:r>
-              <w:rPr>
-                <w:color w:val="000000"/>
-                <w:sz w:val="20"/>
-                <w:szCs w:val="20"/>
-              </w:rPr>
-              <w:t xml:space="preserve">  CAN_RX → GPIO25 (ESP32 IO25 / TWAI RX)</w:t>
+              <w:t>CAN_TX → GPIO25 (ESP32 IO25 / TWAI TX)  |  CAN_RX → GPIO27 (ESP32 IO27 / TWAI RX)</w:t>
             </w:r>
           </w:p>
         </w:tc>
@@ -6048,25 +5580,7 @@
                 <w:sz w:val="20"/>
                 <w:szCs w:val="20"/>
               </w:rPr>
-              <w:t>Pulled to GND via R10 (10</w:t>
-            </w:r>
-            <w:proofErr w:type="gramStart"/>
-            <w:r>
-              <w:rPr>
-                <w:color w:val="000000"/>
-                <w:sz w:val="20"/>
-                <w:szCs w:val="20"/>
-              </w:rPr>
-              <w:t>kΩ) —</w:t>
-            </w:r>
-            <w:proofErr w:type="gramEnd"/>
-            <w:r>
-              <w:rPr>
-                <w:color w:val="000000"/>
-                <w:sz w:val="20"/>
-                <w:szCs w:val="20"/>
-              </w:rPr>
-              <w:t xml:space="preserve"> sets high-speed mode. Do NOT leave floating.</w:t>
+              <w:t>Pulled to GND via R10 (10kΩ) — sets high-speed mode. Do NOT leave floating.</w:t>
             </w:r>
           </w:p>
         </w:tc>
@@ -6194,43 +5708,7 @@
                 <w:sz w:val="20"/>
                 <w:szCs w:val="20"/>
               </w:rPr>
-              <w:t xml:space="preserve">Both jumpers must be fitted together to enable termination. Remove both to </w:t>
-            </w:r>
-            <w:proofErr w:type="spellStart"/>
-            <w:r>
-              <w:rPr>
-                <w:color w:val="000000"/>
-                <w:sz w:val="20"/>
-                <w:szCs w:val="20"/>
-              </w:rPr>
-              <w:t>unterminate</w:t>
-            </w:r>
-            <w:proofErr w:type="spellEnd"/>
-            <w:r>
-              <w:rPr>
-                <w:color w:val="000000"/>
-                <w:sz w:val="20"/>
-                <w:szCs w:val="20"/>
-              </w:rPr>
-              <w:t xml:space="preserve"> (if </w:t>
-            </w:r>
-            <w:proofErr w:type="spellStart"/>
-            <w:r>
-              <w:rPr>
-                <w:color w:val="000000"/>
-                <w:sz w:val="20"/>
-                <w:szCs w:val="20"/>
-              </w:rPr>
-              <w:t>ZombieVerter</w:t>
-            </w:r>
-            <w:proofErr w:type="spellEnd"/>
-            <w:r>
-              <w:rPr>
-                <w:color w:val="000000"/>
-                <w:sz w:val="20"/>
-                <w:szCs w:val="20"/>
-              </w:rPr>
-              <w:t xml:space="preserve"> end already terminated).</w:t>
+              <w:t>Both jumpers must be fitted together to enable termination. Remove both to unterminate (if ZombieVerter end already terminated).</w:t>
             </w:r>
           </w:p>
         </w:tc>
@@ -6422,25 +5900,7 @@
                 <w:sz w:val="20"/>
                 <w:szCs w:val="20"/>
               </w:rPr>
-              <w:t>500 kbps — set in firmware TWAI_TIMING_CONFIG_500</w:t>
-            </w:r>
-            <w:proofErr w:type="gramStart"/>
-            <w:r>
-              <w:rPr>
-                <w:color w:val="000000"/>
-                <w:sz w:val="20"/>
-                <w:szCs w:val="20"/>
-              </w:rPr>
-              <w:t>KBITS(</w:t>
-            </w:r>
-            <w:proofErr w:type="gramEnd"/>
-            <w:r>
-              <w:rPr>
-                <w:color w:val="000000"/>
-                <w:sz w:val="20"/>
-                <w:szCs w:val="20"/>
-              </w:rPr>
-              <w:t>)</w:t>
+              <w:t>500 kbps — set in firmware TWAI_TIMING_CONFIG_500KBITS()</w:t>
             </w:r>
           </w:p>
         </w:tc>
@@ -6451,13 +5911,8 @@
       <w:pPr>
         <w:pStyle w:val="Heading2"/>
       </w:pPr>
-      <w:proofErr w:type="gramStart"/>
-      <w:r>
-        <w:t>4.1  Termination</w:t>
-      </w:r>
-      <w:proofErr w:type="gramEnd"/>
-      <w:r>
-        <w:t xml:space="preserve"> Jumpers JP1 and JP2</w:t>
+      <w:r>
+        <w:t>4.1  Termination Jumpers JP1 and JP2</w:t>
       </w:r>
     </w:p>
     <w:p>
@@ -6480,40 +5935,25 @@
         <w:rPr>
           <w:color w:val="000000"/>
         </w:rPr>
-        <w:t xml:space="preserve">•  JP1 and JP2 both fitted = termination ENABLED — use when the </w:t>
-      </w:r>
-      <w:proofErr w:type="spellStart"/>
+        <w:t>•  JP1 and JP2 both fitted = termination ENABLED — use when the Uniboard is at one end of the CAN bus</w:t>
+      </w:r>
+    </w:p>
+    <w:p>
+      <w:pPr>
+        <w:spacing w:after="120"/>
+      </w:pPr>
       <w:r>
         <w:rPr>
           <w:color w:val="000000"/>
         </w:rPr>
-        <w:t>Uniboard</w:t>
-      </w:r>
-      <w:proofErr w:type="spellEnd"/>
-      <w:r>
-        <w:rPr>
-          <w:color w:val="000000"/>
-        </w:rPr>
-        <w:t xml:space="preserve"> is at one end of the CAN bus</w:t>
-      </w:r>
-    </w:p>
+        <w:t>•  JP1 and JP2 both removed = termination DISABLED — use when another device at the same physical end already has termination</w:t>
+      </w:r>
+    </w:p>
+    <w:p/>
     <w:p>
       <w:pPr>
         <w:spacing w:after="120"/>
       </w:pPr>
-      <w:r>
-        <w:rPr>
-          <w:color w:val="000000"/>
-        </w:rPr>
-        <w:t>•  JP1 and JP2 both removed = termination DISABLED — use when another device at the same physical end already has termination</w:t>
-      </w:r>
-    </w:p>
-    <w:p/>
-    <w:p>
-      <w:pPr>
-        <w:spacing w:after="120"/>
-      </w:pPr>
-      <w:proofErr w:type="gramStart"/>
       <w:r>
         <w:rPr>
           <w:b/>
@@ -6522,9 +5962,65 @@
           <w:sz w:val="20"/>
           <w:szCs w:val="20"/>
         </w:rPr>
-        <w:t>⚠  A</w:t>
-      </w:r>
-      <w:proofErr w:type="gramEnd"/>
+        <w:t>⚠  A CAN bus must have exactly two 120Ω termination resistors — one at each physical end. The ZombieVerter CAN1 port has its own termination. Check whether it is enabled before deciding whether to fit the Uniboard jumpers. Two terminations at the same end = 60Ω = communication errors.</w:t>
+      </w:r>
+    </w:p>
+    <w:p/>
+    <w:p>
+      <w:pPr>
+        <w:pStyle w:val="Heading2"/>
+      </w:pPr>
+      <w:r>
+        <w:t>4.2  CAN GPIO Assignment</w:t>
+      </w:r>
+    </w:p>
+    <w:p>
+      <w:pPr>
+        <w:spacing w:after="120"/>
+      </w:pPr>
+      <w:r>
+        <w:rPr>
+          <w:color w:val="000000"/>
+        </w:rPr>
+        <w:t>The SN65HVD230 is connected to the ESP32 TWAI peripheral as follows:</w:t>
+      </w:r>
+    </w:p>
+    <w:p/>
+    <w:p>
+      <w:pPr>
+        <w:spacing w:after="80"/>
+        <w:ind w:left="360"/>
+      </w:pPr>
+      <w:r>
+        <w:rPr>
+          <w:rFonts w:ascii="Courier New" w:eastAsia="Courier New" w:hAnsi="Courier New" w:cs="Courier New"/>
+          <w:color w:val="C7254E"/>
+          <w:sz w:val="18"/>
+          <w:szCs w:val="18"/>
+        </w:rPr>
+        <w:t>CAN_TX_PIN  GPIO_NUM_25   // ESP32 IO25 → SN65HVD230 D (transmit)</w:t>
+      </w:r>
+    </w:p>
+    <w:p>
+      <w:pPr>
+        <w:spacing w:after="80"/>
+        <w:ind w:left="360"/>
+      </w:pPr>
+      <w:r>
+        <w:rPr>
+          <w:rFonts w:ascii="Courier New" w:eastAsia="Courier New" w:hAnsi="Courier New" w:cs="Courier New"/>
+          <w:color w:val="C7254E"/>
+          <w:sz w:val="18"/>
+          <w:szCs w:val="18"/>
+        </w:rPr>
+        <w:t>CAN_RX_PIN  GPIO_NUM_27   // SN65HVD230 R (receive) → ESP32 IO27</w:t>
+      </w:r>
+    </w:p>
+    <w:p/>
+    <w:p>
+      <w:pPr>
+        <w:spacing w:after="120"/>
+      </w:pPr>
       <w:r>
         <w:rPr>
           <w:b/>
@@ -6533,214 +6029,16 @@
           <w:sz w:val="20"/>
           <w:szCs w:val="20"/>
         </w:rPr>
-        <w:t xml:space="preserve"> CAN bus must have exactly two 120Ω termination resistors — one at each physical end. The </w:t>
-      </w:r>
-      <w:proofErr w:type="spellStart"/>
-      <w:r>
-        <w:rPr>
-          <w:b/>
-          <w:bCs/>
-          <w:color w:val="C00000"/>
-          <w:sz w:val="20"/>
-          <w:szCs w:val="20"/>
-        </w:rPr>
-        <w:t>ZombieVerter</w:t>
-      </w:r>
-      <w:proofErr w:type="spellEnd"/>
-      <w:r>
-        <w:rPr>
-          <w:b/>
-          <w:bCs/>
-          <w:color w:val="C00000"/>
-          <w:sz w:val="20"/>
-          <w:szCs w:val="20"/>
-        </w:rPr>
-        <w:t xml:space="preserve"> CAN1 port has its own termination. Check whether it is enabled before deciding whether to fit the </w:t>
-      </w:r>
-      <w:proofErr w:type="spellStart"/>
-      <w:r>
-        <w:rPr>
-          <w:b/>
-          <w:bCs/>
-          <w:color w:val="C00000"/>
-          <w:sz w:val="20"/>
-          <w:szCs w:val="20"/>
-        </w:rPr>
-        <w:t>Uniboard</w:t>
-      </w:r>
-      <w:proofErr w:type="spellEnd"/>
-      <w:r>
-        <w:rPr>
-          <w:b/>
-          <w:bCs/>
-          <w:color w:val="C00000"/>
-          <w:sz w:val="20"/>
-          <w:szCs w:val="20"/>
-        </w:rPr>
-        <w:t xml:space="preserve"> jumpers. Two terminations at the same end = 60Ω = communication errors.</w:t>
+        <w:t>⚠  These GPIO assignments are swapped from the default ESP32 TWAI example in most tutorials (which use GPIO21/GPIO22). The #define in ev_dashboard.ino already has the correct values for this board.</w:t>
       </w:r>
     </w:p>
     <w:p/>
     <w:p>
       <w:pPr>
-        <w:pStyle w:val="Heading2"/>
-      </w:pPr>
-      <w:proofErr w:type="gramStart"/>
-      <w:r>
-        <w:t>4.2  CAN</w:t>
-      </w:r>
-      <w:proofErr w:type="gramEnd"/>
-      <w:r>
-        <w:t xml:space="preserve"> GPIO Assignment</w:t>
-      </w:r>
-    </w:p>
-    <w:p>
-      <w:pPr>
-        <w:spacing w:after="120"/>
-      </w:pPr>
-      <w:r>
-        <w:rPr>
-          <w:color w:val="000000"/>
-        </w:rPr>
-        <w:t>The SN65HVD230 is connected to the ESP32 TWAI peripheral as follows:</w:t>
-      </w:r>
-    </w:p>
-    <w:p/>
-    <w:p>
-      <w:pPr>
-        <w:spacing w:after="80"/>
-        <w:ind w:left="360"/>
-      </w:pPr>
-      <w:r>
-        <w:rPr>
-          <w:rFonts w:ascii="Courier New" w:eastAsia="Courier New" w:hAnsi="Courier New" w:cs="Courier New"/>
-          <w:color w:val="C7254E"/>
-          <w:sz w:val="18"/>
-          <w:szCs w:val="18"/>
-        </w:rPr>
-        <w:t>CAN_TX_</w:t>
-      </w:r>
-      <w:proofErr w:type="gramStart"/>
-      <w:r>
-        <w:rPr>
-          <w:rFonts w:ascii="Courier New" w:eastAsia="Courier New" w:hAnsi="Courier New" w:cs="Courier New"/>
-          <w:color w:val="C7254E"/>
-          <w:sz w:val="18"/>
-          <w:szCs w:val="18"/>
-        </w:rPr>
-        <w:t>PIN  GPIO</w:t>
-      </w:r>
-      <w:proofErr w:type="gramEnd"/>
-      <w:r>
-        <w:rPr>
-          <w:rFonts w:ascii="Courier New" w:eastAsia="Courier New" w:hAnsi="Courier New" w:cs="Courier New"/>
-          <w:color w:val="C7254E"/>
-          <w:sz w:val="18"/>
-          <w:szCs w:val="18"/>
-        </w:rPr>
-        <w:t>_NUM_27   // ESP32 IO27 → SN65HVD230 D (transmit)</w:t>
-      </w:r>
-    </w:p>
-    <w:p>
-      <w:pPr>
-        <w:spacing w:after="80"/>
-        <w:ind w:left="360"/>
-      </w:pPr>
-      <w:r>
-        <w:rPr>
-          <w:rFonts w:ascii="Courier New" w:eastAsia="Courier New" w:hAnsi="Courier New" w:cs="Courier New"/>
-          <w:color w:val="C7254E"/>
-          <w:sz w:val="18"/>
-          <w:szCs w:val="18"/>
-        </w:rPr>
-        <w:t>CAN_RX_</w:t>
-      </w:r>
-      <w:proofErr w:type="gramStart"/>
-      <w:r>
-        <w:rPr>
-          <w:rFonts w:ascii="Courier New" w:eastAsia="Courier New" w:hAnsi="Courier New" w:cs="Courier New"/>
-          <w:color w:val="C7254E"/>
-          <w:sz w:val="18"/>
-          <w:szCs w:val="18"/>
-        </w:rPr>
-        <w:t>PIN  GPIO</w:t>
-      </w:r>
-      <w:proofErr w:type="gramEnd"/>
-      <w:r>
-        <w:rPr>
-          <w:rFonts w:ascii="Courier New" w:eastAsia="Courier New" w:hAnsi="Courier New" w:cs="Courier New"/>
-          <w:color w:val="C7254E"/>
-          <w:sz w:val="18"/>
-          <w:szCs w:val="18"/>
-        </w:rPr>
-        <w:t>_NUM_25   // SN65HVD230 R (receive) → ESP32 IO25</w:t>
-      </w:r>
-    </w:p>
-    <w:p/>
-    <w:p>
-      <w:pPr>
-        <w:spacing w:after="120"/>
-      </w:pPr>
-      <w:proofErr w:type="gramStart"/>
-      <w:r>
-        <w:rPr>
-          <w:b/>
-          <w:bCs/>
-          <w:color w:val="C00000"/>
-          <w:sz w:val="20"/>
-          <w:szCs w:val="20"/>
-        </w:rPr>
-        <w:t>⚠  These</w:t>
-      </w:r>
-      <w:proofErr w:type="gramEnd"/>
-      <w:r>
-        <w:rPr>
-          <w:b/>
-          <w:bCs/>
-          <w:color w:val="C00000"/>
-          <w:sz w:val="20"/>
-          <w:szCs w:val="20"/>
-        </w:rPr>
-        <w:t xml:space="preserve"> GPIO assignments are swapped from the default ESP32 TWAI example in most tutorials (which use GPIO21/GPIO22). The #define in </w:t>
-      </w:r>
-      <w:proofErr w:type="spellStart"/>
-      <w:r>
-        <w:rPr>
-          <w:b/>
-          <w:bCs/>
-          <w:color w:val="C00000"/>
-          <w:sz w:val="20"/>
-          <w:szCs w:val="20"/>
-        </w:rPr>
-        <w:t>ev_dashboard.ino</w:t>
-      </w:r>
-      <w:proofErr w:type="spellEnd"/>
-      <w:r>
-        <w:rPr>
-          <w:b/>
-          <w:bCs/>
-          <w:color w:val="C00000"/>
-          <w:sz w:val="20"/>
-          <w:szCs w:val="20"/>
-        </w:rPr>
-        <w:t xml:space="preserve"> already has the correct values for this board.</w:t>
-      </w:r>
-    </w:p>
-    <w:p/>
-    <w:p>
-      <w:pPr>
         <w:pStyle w:val="Heading1"/>
       </w:pPr>
       <w:r>
-        <w:t>5</w:t>
-      </w:r>
-      <w:proofErr w:type="gramStart"/>
-      <w:r>
-        <w:t>.  Relay</w:t>
-      </w:r>
-      <w:proofErr w:type="gramEnd"/>
-      <w:r>
-        <w:t xml:space="preserve"> Outputs</w:t>
+        <w:t>5.  Relay Outputs</w:t>
       </w:r>
     </w:p>
     <w:tbl>
@@ -7391,49 +6689,19 @@
         <w:rPr>
           <w:color w:val="000000"/>
         </w:rPr>
-        <w:t xml:space="preserve">Each relay is driven by an MMBT2222A NPN transistor. The ESP32 GPIO drives the transistor base through a 1kΩ resistor. When the GPIO is HIGH, the transistor saturates, </w:t>
-      </w:r>
-      <w:proofErr w:type="spellStart"/>
+        <w:t>Each relay is driven by an MMBT2222A NPN transistor. The ESP32 GPIO drives the transistor base through a 1kΩ resistor. When the GPIO is HIGH, the transistor saturates, energising the relay coil. The LL4148 flyback diode across each coil suppresses the voltage spike when the relay de-energises.</w:t>
+      </w:r>
+    </w:p>
+    <w:p/>
+    <w:p>
+      <w:pPr>
+        <w:spacing w:after="120"/>
+      </w:pPr>
       <w:r>
         <w:rPr>
           <w:color w:val="000000"/>
         </w:rPr>
-        <w:t>energising</w:t>
-      </w:r>
-      <w:proofErr w:type="spellEnd"/>
-      <w:r>
-        <w:rPr>
-          <w:color w:val="000000"/>
-        </w:rPr>
-        <w:t xml:space="preserve"> the relay coil. The LL4148 flyback diode across each </w:t>
-      </w:r>
-      <w:proofErr w:type="gramStart"/>
-      <w:r>
-        <w:rPr>
-          <w:color w:val="000000"/>
-        </w:rPr>
-        <w:t>coil</w:t>
-      </w:r>
-      <w:proofErr w:type="gramEnd"/>
-      <w:r>
-        <w:rPr>
-          <w:color w:val="000000"/>
-        </w:rPr>
-        <w:t xml:space="preserve"> suppresses the voltage spike when the relay de-</w:t>
-      </w:r>
-      <w:proofErr w:type="spellStart"/>
-      <w:r>
-        <w:rPr>
-          <w:color w:val="000000"/>
-        </w:rPr>
-        <w:t>energises</w:t>
-      </w:r>
-      <w:proofErr w:type="spellEnd"/>
-      <w:r>
-        <w:rPr>
-          <w:color w:val="000000"/>
-        </w:rPr>
-        <w:t>.</w:t>
+        <w:t>The relay NO (normally open) contacts are brought out on CN1. The 24V supply from CN4 is routed to the relay common contacts — switching the relay connects 24V to the relevant NO pin. Use these to switch accessories, indicators, or auxiliary contactors.</w:t>
       </w:r>
     </w:p>
     <w:p/>
@@ -7441,19 +6709,6 @@
       <w:pPr>
         <w:spacing w:after="120"/>
       </w:pPr>
-      <w:r>
-        <w:rPr>
-          <w:color w:val="000000"/>
-        </w:rPr>
-        <w:t>The relay NO (normally open) contacts are brought out on CN1. The 24V supply from CN4 is routed to the relay common contacts — switching the relay connects 24V to the relevant NO pin. Use these to switch accessories, indicators, or auxiliary contactors.</w:t>
-      </w:r>
-    </w:p>
-    <w:p/>
-    <w:p>
-      <w:pPr>
-        <w:spacing w:after="120"/>
-      </w:pPr>
-      <w:proofErr w:type="gramStart"/>
       <w:r>
         <w:rPr>
           <w:b/>
@@ -7462,18 +6717,7 @@
           <w:sz w:val="20"/>
           <w:szCs w:val="20"/>
         </w:rPr>
-        <w:t>⚠  The</w:t>
-      </w:r>
-      <w:proofErr w:type="gramEnd"/>
-      <w:r>
-        <w:rPr>
-          <w:b/>
-          <w:bCs/>
-          <w:color w:val="C00000"/>
-          <w:sz w:val="20"/>
-          <w:szCs w:val="20"/>
-        </w:rPr>
-        <w:t xml:space="preserve"> relay contacts are rated 10A/30VDC. For higher current or voltage loads, use the relay to switch an external contactor rated for that load.</w:t>
+        <w:t>⚠  The relay contacts are rated 10A/30VDC. For higher current or voltage loads, use the relay to switch an external contactor rated for that load.</w:t>
       </w:r>
     </w:p>
     <w:p/>
@@ -7482,15 +6726,7 @@
         <w:pStyle w:val="Heading1"/>
       </w:pPr>
       <w:r>
-        <w:t>6</w:t>
-      </w:r>
-      <w:proofErr w:type="gramStart"/>
-      <w:r>
-        <w:t>.  Level</w:t>
-      </w:r>
-      <w:proofErr w:type="gramEnd"/>
-      <w:r>
-        <w:t>-Shifted GPIO Outputs</w:t>
+        <w:t>6.  Level-Shifted GPIO Outputs</w:t>
       </w:r>
     </w:p>
     <w:p>
@@ -7846,18 +7082,8 @@
                 <w:sz w:val="20"/>
                 <w:szCs w:val="20"/>
               </w:rPr>
-              <w:t xml:space="preserve">Allows ESP32 3.3V GPIO to drive 5V logic devices such as external displays, relays, or sensors that require 5V </w:t>
-            </w:r>
-            <w:proofErr w:type="spellStart"/>
-            <w:r>
-              <w:rPr>
-                <w:color w:val="000000"/>
-                <w:sz w:val="20"/>
-                <w:szCs w:val="20"/>
-              </w:rPr>
-              <w:t>signalling</w:t>
-            </w:r>
-            <w:proofErr w:type="spellEnd"/>
+              <w:t>Allows ESP32 3.3V GPIO to drive 5V logic devices such as external displays, relays, or sensors that require 5V signalling</w:t>
+            </w:r>
           </w:p>
         </w:tc>
       </w:tr>
@@ -7880,15 +7106,7 @@
         <w:pStyle w:val="Heading1"/>
       </w:pPr>
       <w:r>
-        <w:t>7</w:t>
-      </w:r>
-      <w:proofErr w:type="gramStart"/>
-      <w:r>
-        <w:t>.  Optocoupler</w:t>
-      </w:r>
-      <w:proofErr w:type="gramEnd"/>
-      <w:r>
-        <w:t xml:space="preserve"> Input (OPTO)</w:t>
+        <w:t>7.  Optocoupler Input (OPTO)</w:t>
       </w:r>
     </w:p>
     <w:p>
@@ -7932,28 +7150,15 @@
         <w:pStyle w:val="Heading1"/>
       </w:pPr>
       <w:r>
-        <w:t>8</w:t>
-      </w:r>
-      <w:proofErr w:type="gramStart"/>
-      <w:r>
-        <w:t>.  Programming</w:t>
-      </w:r>
-      <w:proofErr w:type="gramEnd"/>
-      <w:r>
-        <w:t xml:space="preserve"> the Board</w:t>
+        <w:t>8.  Programming the Board</w:t>
       </w:r>
     </w:p>
     <w:p>
       <w:pPr>
         <w:pStyle w:val="Heading2"/>
       </w:pPr>
-      <w:proofErr w:type="gramStart"/>
-      <w:r>
-        <w:t>8.1  USB</w:t>
-      </w:r>
-      <w:proofErr w:type="gramEnd"/>
-      <w:r>
-        <w:t>-C Port</w:t>
+      <w:r>
+        <w:t>8.1  USB-C Port</w:t>
       </w:r>
     </w:p>
     <w:p>
@@ -7984,13 +7189,8 @@
       <w:pPr>
         <w:pStyle w:val="Heading2"/>
       </w:pPr>
-      <w:proofErr w:type="gramStart"/>
-      <w:r>
-        <w:t>8.2  Arduino</w:t>
-      </w:r>
-      <w:proofErr w:type="gramEnd"/>
-      <w:r>
-        <w:t xml:space="preserve"> IDE Settings</w:t>
+      <w:r>
+        <w:t>8.2  Arduino IDE Settings</w:t>
       </w:r>
     </w:p>
     <w:p>
@@ -8065,13 +7265,8 @@
       <w:pPr>
         <w:pStyle w:val="Heading2"/>
       </w:pPr>
-      <w:proofErr w:type="gramStart"/>
-      <w:r>
-        <w:t>8.3  Manual</w:t>
-      </w:r>
-      <w:proofErr w:type="gramEnd"/>
-      <w:r>
-        <w:t xml:space="preserve"> Boot Mode</w:t>
+      <w:r>
+        <w:t>8.3  Manual Boot Mode</w:t>
       </w:r>
     </w:p>
     <w:p>
@@ -8093,21 +7288,29 @@
         <w:rPr>
           <w:color w:val="000000"/>
         </w:rPr>
-        <w:t>1</w:t>
-      </w:r>
-      <w:proofErr w:type="gramStart"/>
+        <w:t>1.  Hold BOOT button</w:t>
+      </w:r>
+    </w:p>
+    <w:p>
+      <w:pPr>
+        <w:spacing w:after="120"/>
+      </w:pPr>
       <w:r>
         <w:rPr>
           <w:color w:val="000000"/>
         </w:rPr>
-        <w:t>.  Hold</w:t>
-      </w:r>
-      <w:proofErr w:type="gramEnd"/>
+        <w:t>2.  Press and release RST button</w:t>
+      </w:r>
+    </w:p>
+    <w:p>
+      <w:pPr>
+        <w:spacing w:after="120"/>
+      </w:pPr>
       <w:r>
         <w:rPr>
           <w:color w:val="000000"/>
         </w:rPr>
-        <w:t xml:space="preserve"> BOOT button</w:t>
+        <w:t>3.  Release BOOT button</w:t>
       </w:r>
     </w:p>
     <w:p>
@@ -8118,79 +7321,14 @@
         <w:rPr>
           <w:color w:val="000000"/>
         </w:rPr>
-        <w:t>2</w:t>
-      </w:r>
-      <w:proofErr w:type="gramStart"/>
-      <w:r>
-        <w:rPr>
-          <w:color w:val="000000"/>
-        </w:rPr>
-        <w:t>.  Press</w:t>
-      </w:r>
-      <w:proofErr w:type="gramEnd"/>
-      <w:r>
-        <w:rPr>
-          <w:color w:val="000000"/>
-        </w:rPr>
-        <w:t xml:space="preserve"> and release RST button</w:t>
-      </w:r>
-    </w:p>
+        <w:t>4.  Click Upload in Arduino IDE</w:t>
+      </w:r>
+    </w:p>
+    <w:p/>
     <w:p>
       <w:pPr>
         <w:spacing w:after="120"/>
       </w:pPr>
-      <w:r>
-        <w:rPr>
-          <w:color w:val="000000"/>
-        </w:rPr>
-        <w:t>3</w:t>
-      </w:r>
-      <w:proofErr w:type="gramStart"/>
-      <w:r>
-        <w:rPr>
-          <w:color w:val="000000"/>
-        </w:rPr>
-        <w:t>.  Release</w:t>
-      </w:r>
-      <w:proofErr w:type="gramEnd"/>
-      <w:r>
-        <w:rPr>
-          <w:color w:val="000000"/>
-        </w:rPr>
-        <w:t xml:space="preserve"> BOOT button</w:t>
-      </w:r>
-    </w:p>
-    <w:p>
-      <w:pPr>
-        <w:spacing w:after="120"/>
-      </w:pPr>
-      <w:r>
-        <w:rPr>
-          <w:color w:val="000000"/>
-        </w:rPr>
-        <w:t>4</w:t>
-      </w:r>
-      <w:proofErr w:type="gramStart"/>
-      <w:r>
-        <w:rPr>
-          <w:color w:val="000000"/>
-        </w:rPr>
-        <w:t>.  Click</w:t>
-      </w:r>
-      <w:proofErr w:type="gramEnd"/>
-      <w:r>
-        <w:rPr>
-          <w:color w:val="000000"/>
-        </w:rPr>
-        <w:t xml:space="preserve"> Upload in Arduino IDE</w:t>
-      </w:r>
-    </w:p>
-    <w:p/>
-    <w:p>
-      <w:pPr>
-        <w:spacing w:after="120"/>
-      </w:pPr>
-      <w:proofErr w:type="gramStart"/>
       <w:r>
         <w:rPr>
           <w:b/>
@@ -8199,18 +7337,7 @@
           <w:sz w:val="20"/>
           <w:szCs w:val="20"/>
         </w:rPr>
-        <w:t>⚠  The</w:t>
-      </w:r>
-      <w:proofErr w:type="gramEnd"/>
-      <w:r>
-        <w:rPr>
-          <w:b/>
-          <w:bCs/>
-          <w:color w:val="C00000"/>
-          <w:sz w:val="20"/>
-          <w:szCs w:val="20"/>
-        </w:rPr>
-        <w:t xml:space="preserve"> 24V supply does not need to be connected for programming. USB-C alone powers the ESP32 and CH340C via the VUSB rail.</w:t>
+        <w:t>⚠  The 24V supply does not need to be connected for programming. USB-C alone powers the ESP32 and CH340C via the VUSB rail.</w:t>
       </w:r>
     </w:p>
     <w:p/>
@@ -8219,13 +7346,8 @@
         <w:pStyle w:val="Heading1"/>
       </w:pPr>
       <w:r>
-        <w:t xml:space="preserve">9.  Wiring to </w:t>
-      </w:r>
-      <w:proofErr w:type="spellStart"/>
-      <w:r>
-        <w:t>ZombieVerter</w:t>
-      </w:r>
-      <w:proofErr w:type="spellEnd"/>
+        <w:t>9.  Wiring to ZombieVerter</w:t>
+      </w:r>
     </w:p>
     <w:tbl>
       <w:tblPr>
@@ -8459,23 +7581,13 @@
             </w:tcMar>
           </w:tcPr>
           <w:p>
-            <w:proofErr w:type="spellStart"/>
-            <w:r>
-              <w:rPr>
-                <w:color w:val="000000"/>
-                <w:sz w:val="20"/>
-                <w:szCs w:val="20"/>
-              </w:rPr>
-              <w:t>ZombieVerter</w:t>
-            </w:r>
-            <w:proofErr w:type="spellEnd"/>
-            <w:r>
-              <w:rPr>
-                <w:color w:val="000000"/>
-                <w:sz w:val="20"/>
-                <w:szCs w:val="20"/>
-              </w:rPr>
-              <w:t xml:space="preserve"> CAN1 CANH</w:t>
+            <w:r>
+              <w:rPr>
+                <w:color w:val="000000"/>
+                <w:sz w:val="20"/>
+                <w:szCs w:val="20"/>
+              </w:rPr>
+              <w:t>ZombieVerter CAN1 CANH</w:t>
             </w:r>
           </w:p>
         </w:tc>
@@ -8589,23 +7701,13 @@
             </w:tcMar>
           </w:tcPr>
           <w:p>
-            <w:proofErr w:type="spellStart"/>
-            <w:r>
-              <w:rPr>
-                <w:color w:val="000000"/>
-                <w:sz w:val="20"/>
-                <w:szCs w:val="20"/>
-              </w:rPr>
-              <w:t>ZombieVerter</w:t>
-            </w:r>
-            <w:proofErr w:type="spellEnd"/>
-            <w:r>
-              <w:rPr>
-                <w:color w:val="000000"/>
-                <w:sz w:val="20"/>
-                <w:szCs w:val="20"/>
-              </w:rPr>
-              <w:t xml:space="preserve"> CAN1 CANL</w:t>
+            <w:r>
+              <w:rPr>
+                <w:color w:val="000000"/>
+                <w:sz w:val="20"/>
+                <w:szCs w:val="20"/>
+              </w:rPr>
+              <w:t>ZombieVerter CAN1 CANL</w:t>
             </w:r>
           </w:p>
         </w:tc>
@@ -8725,25 +7827,7 @@
                 <w:sz w:val="20"/>
                 <w:szCs w:val="20"/>
               </w:rPr>
-              <w:t xml:space="preserve">Vehicle </w:t>
-            </w:r>
-            <w:proofErr w:type="gramStart"/>
-            <w:r>
-              <w:rPr>
-                <w:color w:val="000000"/>
-                <w:sz w:val="20"/>
-                <w:szCs w:val="20"/>
-              </w:rPr>
-              <w:t>run-mode</w:t>
-            </w:r>
-            <w:proofErr w:type="gramEnd"/>
-            <w:r>
-              <w:rPr>
-                <w:color w:val="000000"/>
-                <w:sz w:val="20"/>
-                <w:szCs w:val="20"/>
-              </w:rPr>
-              <w:t xml:space="preserve"> switched supply</w:t>
+              <w:t>Vehicle run-mode switched supply</w:t>
             </w:r>
           </w:p>
         </w:tc>
@@ -9266,33 +8350,15 @@
         <w:pStyle w:val="Heading1"/>
       </w:pPr>
       <w:r>
-        <w:t>10</w:t>
-      </w:r>
-      <w:proofErr w:type="gramStart"/>
-      <w:r>
-        <w:t xml:space="preserve">.  </w:t>
-      </w:r>
-      <w:proofErr w:type="spellStart"/>
-      <w:r>
-        <w:t>ZombieVerter</w:t>
-      </w:r>
-      <w:proofErr w:type="spellEnd"/>
-      <w:proofErr w:type="gramEnd"/>
-      <w:r>
-        <w:t xml:space="preserve"> Configuration</w:t>
+        <w:t>10.  ZombieVerter Configuration</w:t>
       </w:r>
     </w:p>
     <w:p>
       <w:pPr>
         <w:pStyle w:val="Heading2"/>
       </w:pPr>
-      <w:proofErr w:type="gramStart"/>
-      <w:r>
-        <w:t>10.1  CAN</w:t>
-      </w:r>
-      <w:proofErr w:type="gramEnd"/>
-      <w:r>
-        <w:t xml:space="preserve"> Parameters</w:t>
+      <w:r>
+        <w:t>10.1  CAN Parameters</w:t>
       </w:r>
     </w:p>
     <w:p>
@@ -9303,136 +8369,39 @@
         <w:rPr>
           <w:color w:val="000000"/>
         </w:rPr>
-        <w:t xml:space="preserve">•  </w:t>
-      </w:r>
-      <w:proofErr w:type="spellStart"/>
+        <w:t>•  canspeed = 500000  (must match firmware TWAI_TIMING_CONFIG_500KBITS)</w:t>
+      </w:r>
+    </w:p>
+    <w:p>
+      <w:pPr>
+        <w:spacing w:after="120"/>
+      </w:pPr>
       <w:r>
         <w:rPr>
           <w:color w:val="000000"/>
         </w:rPr>
-        <w:t>canspeed</w:t>
-      </w:r>
-      <w:proofErr w:type="spellEnd"/>
+        <w:lastRenderedPageBreak/>
+        <w:t>•  canmapcan = can1   (user TX messages broadcast on CAN1 where Uniboard is connected)</w:t>
+      </w:r>
+    </w:p>
+    <w:p/>
+    <w:p>
+      <w:pPr>
+        <w:pStyle w:val="Heading2"/>
+      </w:pPr>
+      <w:r>
+        <w:t>10.2  Required TX Entries</w:t>
+      </w:r>
+    </w:p>
+    <w:p>
+      <w:pPr>
+        <w:spacing w:after="120"/>
+      </w:pPr>
       <w:r>
         <w:rPr>
           <w:color w:val="000000"/>
         </w:rPr>
-        <w:t xml:space="preserve"> = </w:t>
-      </w:r>
-      <w:proofErr w:type="gramStart"/>
-      <w:r>
-        <w:rPr>
-          <w:color w:val="000000"/>
-        </w:rPr>
-        <w:t>500000  (</w:t>
-      </w:r>
-      <w:proofErr w:type="gramEnd"/>
-      <w:r>
-        <w:rPr>
-          <w:color w:val="000000"/>
-        </w:rPr>
-        <w:t>must match firmware TWAI_TIMING_CONFIG_500KBITS)</w:t>
-      </w:r>
-    </w:p>
-    <w:p>
-      <w:pPr>
-        <w:spacing w:after="120"/>
-      </w:pPr>
-      <w:r>
-        <w:rPr>
-          <w:color w:val="000000"/>
-        </w:rPr>
-        <w:lastRenderedPageBreak/>
-        <w:t xml:space="preserve">•  </w:t>
-      </w:r>
-      <w:proofErr w:type="spellStart"/>
-      <w:r>
-        <w:rPr>
-          <w:color w:val="000000"/>
-        </w:rPr>
-        <w:t>canmapcan</w:t>
-      </w:r>
-      <w:proofErr w:type="spellEnd"/>
-      <w:r>
-        <w:rPr>
-          <w:color w:val="000000"/>
-        </w:rPr>
-        <w:t xml:space="preserve"> = can1</w:t>
-      </w:r>
-      <w:proofErr w:type="gramStart"/>
-      <w:r>
-        <w:rPr>
-          <w:color w:val="000000"/>
-        </w:rPr>
-        <w:t xml:space="preserve">   (</w:t>
-      </w:r>
-      <w:proofErr w:type="gramEnd"/>
-      <w:r>
-        <w:rPr>
-          <w:color w:val="000000"/>
-        </w:rPr>
-        <w:t xml:space="preserve">user TX messages broadcast on CAN1 where </w:t>
-      </w:r>
-      <w:proofErr w:type="spellStart"/>
-      <w:r>
-        <w:rPr>
-          <w:color w:val="000000"/>
-        </w:rPr>
-        <w:t>Uniboard</w:t>
-      </w:r>
-      <w:proofErr w:type="spellEnd"/>
-      <w:r>
-        <w:rPr>
-          <w:color w:val="000000"/>
-        </w:rPr>
-        <w:t xml:space="preserve"> is connected)</w:t>
-      </w:r>
-    </w:p>
-    <w:p/>
-    <w:p>
-      <w:pPr>
-        <w:pStyle w:val="Heading2"/>
-      </w:pPr>
-      <w:proofErr w:type="gramStart"/>
-      <w:r>
-        <w:t>10.2  Required</w:t>
-      </w:r>
-      <w:proofErr w:type="gramEnd"/>
-      <w:r>
-        <w:t xml:space="preserve"> TX Entries</w:t>
-      </w:r>
-    </w:p>
-    <w:p>
-      <w:pPr>
-        <w:spacing w:after="120"/>
-      </w:pPr>
-      <w:proofErr w:type="gramStart"/>
-      <w:r>
-        <w:rPr>
-          <w:color w:val="000000"/>
-        </w:rPr>
-        <w:t>Enter in</w:t>
-      </w:r>
-      <w:proofErr w:type="gramEnd"/>
-      <w:r>
-        <w:rPr>
-          <w:color w:val="000000"/>
-        </w:rPr>
-        <w:t xml:space="preserve"> </w:t>
-      </w:r>
-      <w:proofErr w:type="spellStart"/>
-      <w:r>
-        <w:rPr>
-          <w:color w:val="000000"/>
-        </w:rPr>
-        <w:t>ZombieVerter</w:t>
-      </w:r>
-      <w:proofErr w:type="spellEnd"/>
-      <w:r>
-        <w:rPr>
-          <w:color w:val="000000"/>
-        </w:rPr>
-        <w:t xml:space="preserve"> command line:</w:t>
+        <w:t>Enter in ZombieVerter command line:</w:t>
       </w:r>
     </w:p>
     <w:p/>
@@ -9448,9 +8417,14 @@
           <w:sz w:val="18"/>
           <w:szCs w:val="18"/>
         </w:rPr>
-        <w:t xml:space="preserve">can </w:t>
-      </w:r>
-      <w:proofErr w:type="spellStart"/>
+        <w:t>can tx drivedir 794 0 8 1 0</w:t>
+      </w:r>
+    </w:p>
+    <w:p>
+      <w:pPr>
+        <w:spacing w:after="80"/>
+        <w:ind w:left="360"/>
+      </w:pPr>
       <w:r>
         <w:rPr>
           <w:rFonts w:ascii="Courier New" w:eastAsia="Courier New" w:hAnsi="Courier New" w:cs="Courier New"/>
@@ -9458,9 +8432,14 @@
           <w:sz w:val="18"/>
           <w:szCs w:val="18"/>
         </w:rPr>
-        <w:t>tx</w:t>
-      </w:r>
-      <w:proofErr w:type="spellEnd"/>
+        <w:t>can tx opmode   794 8 8 1 0</w:t>
+      </w:r>
+    </w:p>
+    <w:p>
+      <w:pPr>
+        <w:spacing w:after="80"/>
+        <w:ind w:left="360"/>
+      </w:pPr>
       <w:r>
         <w:rPr>
           <w:rFonts w:ascii="Courier New" w:eastAsia="Courier New" w:hAnsi="Courier New" w:cs="Courier New"/>
@@ -9468,9 +8447,55 @@
           <w:sz w:val="18"/>
           <w:szCs w:val="18"/>
         </w:rPr>
-        <w:t xml:space="preserve"> </w:t>
-      </w:r>
-      <w:proofErr w:type="spellStart"/>
+        <w:t>save</w:t>
+      </w:r>
+    </w:p>
+    <w:p/>
+    <w:p>
+      <w:pPr>
+        <w:spacing w:after="120"/>
+      </w:pPr>
+      <w:r>
+        <w:rPr>
+          <w:color w:val="000000"/>
+        </w:rPr>
+        <w:t>Power cycle after saving. Verify with the CAN sniffer that 0x31A (794 decimal) appears on the bus.</w:t>
+      </w:r>
+    </w:p>
+    <w:p/>
+    <w:p>
+      <w:pPr>
+        <w:pStyle w:val="Heading1"/>
+      </w:pPr>
+      <w:r>
+        <w:t>11.  CAN Frame Reference  (Native Leaf Frames)</w:t>
+      </w:r>
+    </w:p>
+    <w:p>
+      <w:pPr>
+        <w:spacing w:after="120"/>
+      </w:pPr>
+      <w:r>
+        <w:rPr>
+          <w:color w:val="000000"/>
+        </w:rPr>
+        <w:t>The firmware reads these Leaf CAN1 frames directly. No ZombieVerter CAN map RX entries are needed.</w:t>
+      </w:r>
+    </w:p>
+    <w:p/>
+    <w:p>
+      <w:pPr>
+        <w:pStyle w:val="Heading3"/>
+      </w:pPr>
+      <w:r>
+        <w:t>0x1DA / 474</w:t>
+      </w:r>
+    </w:p>
+    <w:p>
+      <w:pPr>
+        <w:spacing w:after="80"/>
+        <w:ind w:left="360"/>
+      </w:pPr>
       <w:r>
         <w:rPr>
           <w:rFonts w:ascii="Courier New" w:eastAsia="Courier New" w:hAnsi="Courier New" w:cs="Courier New"/>
@@ -9478,9 +8503,14 @@
           <w:sz w:val="18"/>
           <w:szCs w:val="18"/>
         </w:rPr>
-        <w:t>drivedir</w:t>
-      </w:r>
-      <w:proofErr w:type="spellEnd"/>
+        <w:t>voltage = ((bytes[0] &lt;&lt; 2) | (bytes[1] &gt;&gt; 6)) × 0.5   // V, 10-bit</w:t>
+      </w:r>
+    </w:p>
+    <w:p>
+      <w:pPr>
+        <w:spacing w:after="80"/>
+        <w:ind w:left="360"/>
+      </w:pPr>
       <w:r>
         <w:rPr>
           <w:rFonts w:ascii="Courier New" w:eastAsia="Courier New" w:hAnsi="Courier New" w:cs="Courier New"/>
@@ -9488,7 +8518,7 @@
           <w:sz w:val="18"/>
           <w:szCs w:val="18"/>
         </w:rPr>
-        <w:t xml:space="preserve"> 794 0 8 1 0</w:t>
+        <w:t>speed   = int16(bytes[4]&lt;&lt;8 | bytes[5]) × 0.5          // RPM</w:t>
       </w:r>
     </w:p>
     <w:p>
@@ -9503,9 +8533,23 @@
           <w:sz w:val="18"/>
           <w:szCs w:val="18"/>
         </w:rPr>
-        <w:t xml:space="preserve">can </w:t>
-      </w:r>
-      <w:proofErr w:type="spellStart"/>
+        <w:t>error   = (bytes[6] &amp; 0xB0) != 0x00                    // fault flags</w:t>
+      </w:r>
+    </w:p>
+    <w:p/>
+    <w:p>
+      <w:pPr>
+        <w:pStyle w:val="Heading3"/>
+      </w:pPr>
+      <w:r>
+        <w:t>0x55A / 1370</w:t>
+      </w:r>
+    </w:p>
+    <w:p>
+      <w:pPr>
+        <w:spacing w:after="80"/>
+        <w:ind w:left="360"/>
+      </w:pPr>
       <w:r>
         <w:rPr>
           <w:rFonts w:ascii="Courier New" w:eastAsia="Courier New" w:hAnsi="Courier New" w:cs="Courier New"/>
@@ -9513,9 +8557,14 @@
           <w:sz w:val="18"/>
           <w:szCs w:val="18"/>
         </w:rPr>
-        <w:t>tx</w:t>
-      </w:r>
-      <w:proofErr w:type="spellEnd"/>
+        <w:t>motor_temp_c    = fahrenheit_to_celsius(bytes[1])</w:t>
+      </w:r>
+    </w:p>
+    <w:p>
+      <w:pPr>
+        <w:spacing w:after="80"/>
+        <w:ind w:left="360"/>
+      </w:pPr>
       <w:r>
         <w:rPr>
           <w:rFonts w:ascii="Courier New" w:eastAsia="Courier New" w:hAnsi="Courier New" w:cs="Courier New"/>
@@ -9523,9 +8572,23 @@
           <w:sz w:val="18"/>
           <w:szCs w:val="18"/>
         </w:rPr>
-        <w:t xml:space="preserve"> </w:t>
-      </w:r>
-      <w:proofErr w:type="spellStart"/>
+        <w:t>inverter_temp_c = fahrenheit_to_celsius(bytes[2])</w:t>
+      </w:r>
+    </w:p>
+    <w:p/>
+    <w:p>
+      <w:pPr>
+        <w:pStyle w:val="Heading3"/>
+      </w:pPr>
+      <w:r>
+        <w:t>0x55B / 1371</w:t>
+      </w:r>
+    </w:p>
+    <w:p>
+      <w:pPr>
+        <w:spacing w:after="80"/>
+        <w:ind w:left="360"/>
+      </w:pPr>
       <w:r>
         <w:rPr>
           <w:rFonts w:ascii="Courier New" w:eastAsia="Courier New" w:hAnsi="Courier New" w:cs="Courier New"/>
@@ -9533,9 +8596,23 @@
           <w:sz w:val="18"/>
           <w:szCs w:val="18"/>
         </w:rPr>
-        <w:t>opmode</w:t>
-      </w:r>
-      <w:proofErr w:type="spellEnd"/>
+        <w:t>soc = ((bytes[0]&lt;&lt;2) | (bytes[1]&gt;&gt;6)) × 0.1   // %  (25% = raw 250 = 0x00FA)</w:t>
+      </w:r>
+    </w:p>
+    <w:p/>
+    <w:p>
+      <w:pPr>
+        <w:pStyle w:val="Heading3"/>
+      </w:pPr>
+      <w:r>
+        <w:t>0x1DB / 475</w:t>
+      </w:r>
+    </w:p>
+    <w:p>
+      <w:pPr>
+        <w:spacing w:after="80"/>
+        <w:ind w:left="360"/>
+      </w:pPr>
       <w:r>
         <w:rPr>
           <w:rFonts w:ascii="Courier New" w:eastAsia="Courier New" w:hAnsi="Courier New" w:cs="Courier New"/>
@@ -9543,7 +8620,7 @@
           <w:sz w:val="18"/>
           <w:szCs w:val="18"/>
         </w:rPr>
-        <w:t xml:space="preserve">   794 8 8 1 0</w:t>
+        <w:t>cur = ((bytes[0]&lt;&lt;3) | (bytes[1]&gt;&gt;5))</w:t>
       </w:r>
     </w:p>
     <w:p>
@@ -9558,78 +8635,16 @@
           <w:sz w:val="18"/>
           <w:szCs w:val="18"/>
         </w:rPr>
-        <w:t>save</w:t>
+        <w:t>if (cur &gt; 1023) cur -= 2047   // 11-bit signed correction</w:t>
       </w:r>
     </w:p>
     <w:p/>
     <w:p>
       <w:pPr>
-        <w:spacing w:after="120"/>
-      </w:pPr>
-      <w:r>
-        <w:rPr>
-          <w:color w:val="000000"/>
-        </w:rPr>
-        <w:t>Power cycle after saving. Verify with the CAN sniffer that 0x31A (794 decimal) appears on the bus.</w:t>
-      </w:r>
-    </w:p>
-    <w:p/>
-    <w:p>
-      <w:pPr>
-        <w:pStyle w:val="Heading1"/>
-      </w:pPr>
-      <w:r>
-        <w:t>11</w:t>
-      </w:r>
-      <w:proofErr w:type="gramStart"/>
-      <w:r>
-        <w:t>.  CAN</w:t>
-      </w:r>
-      <w:proofErr w:type="gramEnd"/>
-      <w:r>
-        <w:t xml:space="preserve"> Frame </w:t>
-      </w:r>
-      <w:proofErr w:type="gramStart"/>
-      <w:r>
-        <w:t>Reference  (</w:t>
-      </w:r>
-      <w:proofErr w:type="gramEnd"/>
-      <w:r>
-        <w:t>Native Leaf Frames)</w:t>
-      </w:r>
-    </w:p>
-    <w:p>
-      <w:pPr>
-        <w:spacing w:after="120"/>
-      </w:pPr>
-      <w:r>
-        <w:rPr>
-          <w:color w:val="000000"/>
-        </w:rPr>
-        <w:t xml:space="preserve">The firmware reads these Leaf CAN1 frames directly. No </w:t>
-      </w:r>
-      <w:proofErr w:type="spellStart"/>
-      <w:r>
-        <w:rPr>
-          <w:color w:val="000000"/>
-        </w:rPr>
-        <w:t>ZombieVerter</w:t>
-      </w:r>
-      <w:proofErr w:type="spellEnd"/>
-      <w:r>
-        <w:rPr>
-          <w:color w:val="000000"/>
-        </w:rPr>
-        <w:t xml:space="preserve"> CAN map RX entries are needed.</w:t>
-      </w:r>
-    </w:p>
-    <w:p/>
-    <w:p>
-      <w:pPr>
         <w:pStyle w:val="Heading3"/>
       </w:pPr>
       <w:r>
-        <w:t>0x1DA / 474</w:t>
+        <w:t>0x390 / 912</w:t>
       </w:r>
     </w:p>
     <w:p>
@@ -9644,9 +8659,14 @@
           <w:sz w:val="18"/>
           <w:szCs w:val="18"/>
         </w:rPr>
-        <w:t>voltage = ((</w:t>
-      </w:r>
-      <w:proofErr w:type="gramStart"/>
+        <w:t>OBCVoltStat = (bytes[3]&gt;&gt;3) &amp; 0x03</w:t>
+      </w:r>
+    </w:p>
+    <w:p>
+      <w:pPr>
+        <w:spacing w:after="80"/>
+        <w:ind w:left="360"/>
+      </w:pPr>
       <w:r>
         <w:rPr>
           <w:rFonts w:ascii="Courier New" w:eastAsia="Courier New" w:hAnsi="Courier New" w:cs="Courier New"/>
@@ -9654,9 +8674,23 @@
           <w:sz w:val="18"/>
           <w:szCs w:val="18"/>
         </w:rPr>
-        <w:t>bytes[</w:t>
-      </w:r>
-      <w:proofErr w:type="gramEnd"/>
+        <w:t>PlugStat    = bytes[5] &amp; 0x0F   // 0x08 = plugged in</w:t>
+      </w:r>
+    </w:p>
+    <w:p/>
+    <w:p>
+      <w:pPr>
+        <w:pStyle w:val="Heading3"/>
+      </w:pPr>
+      <w:r>
+        <w:t>0x31A / 794  (ZombieVerter TX)</w:t>
+      </w:r>
+    </w:p>
+    <w:p>
+      <w:pPr>
+        <w:spacing w:after="80"/>
+        <w:ind w:left="360"/>
+      </w:pPr>
       <w:r>
         <w:rPr>
           <w:rFonts w:ascii="Courier New" w:eastAsia="Courier New" w:hAnsi="Courier New" w:cs="Courier New"/>
@@ -9664,9 +8698,14 @@
           <w:sz w:val="18"/>
           <w:szCs w:val="18"/>
         </w:rPr>
-        <w:t>0] &lt;&lt; 2) | (</w:t>
-      </w:r>
-      <w:proofErr w:type="gramStart"/>
+        <w:t>drivedir = int8(bytes[0])   // -1=Reverse  0=Neutral  1=Forward</w:t>
+      </w:r>
+    </w:p>
+    <w:p>
+      <w:pPr>
+        <w:spacing w:after="80"/>
+        <w:ind w:left="360"/>
+      </w:pPr>
       <w:r>
         <w:rPr>
           <w:rFonts w:ascii="Courier New" w:eastAsia="Courier New" w:hAnsi="Courier New" w:cs="Courier New"/>
@@ -9674,9 +8713,24 @@
           <w:sz w:val="18"/>
           <w:szCs w:val="18"/>
         </w:rPr>
-        <w:t>bytes[</w:t>
-      </w:r>
-      <w:proofErr w:type="gramEnd"/>
+        <w:t>opmode   = int8(bytes[1])   // 0=Off 1=Run 2=PreCharge 3=Fail 4=Charging</w:t>
+      </w:r>
+    </w:p>
+    <w:p/>
+    <w:p>
+      <w:pPr>
+        <w:pStyle w:val="Heading1"/>
+      </w:pPr>
+      <w:r>
+        <w:lastRenderedPageBreak/>
+        <w:t>12.  Code File Structure</w:t>
+      </w:r>
+    </w:p>
+    <w:p>
+      <w:pPr>
+        <w:spacing w:after="80"/>
+        <w:ind w:left="360"/>
+      </w:pPr>
       <w:r>
         <w:rPr>
           <w:rFonts w:ascii="Courier New" w:eastAsia="Courier New" w:hAnsi="Courier New" w:cs="Courier New"/>
@@ -9684,7 +8738,7 @@
           <w:sz w:val="18"/>
           <w:szCs w:val="18"/>
         </w:rPr>
-        <w:t>1] &gt;&gt; 6)) × 0.5   // V, 10-bit</w:t>
+        <w:t>ev_dashboard/</w:t>
       </w:r>
     </w:p>
     <w:p>
@@ -9699,9 +8753,14 @@
           <w:sz w:val="18"/>
           <w:szCs w:val="18"/>
         </w:rPr>
-        <w:t>speed   = int16(</w:t>
-      </w:r>
-      <w:proofErr w:type="gramStart"/>
+        <w:t xml:space="preserve">  ev_dashboard.ino     ← main sketch — open this in Arduino IDE</w:t>
+      </w:r>
+    </w:p>
+    <w:p>
+      <w:pPr>
+        <w:spacing w:after="80"/>
+        <w:ind w:left="360"/>
+      </w:pPr>
       <w:r>
         <w:rPr>
           <w:rFonts w:ascii="Courier New" w:eastAsia="Courier New" w:hAnsi="Courier New" w:cs="Courier New"/>
@@ -9709,9 +8768,14 @@
           <w:sz w:val="18"/>
           <w:szCs w:val="18"/>
         </w:rPr>
-        <w:t>bytes[4]&lt;</w:t>
-      </w:r>
-      <w:proofErr w:type="gramEnd"/>
+        <w:t xml:space="preserve">  driverpage.h         ← driver dashboard HTML</w:t>
+      </w:r>
+    </w:p>
+    <w:p>
+      <w:pPr>
+        <w:spacing w:after="80"/>
+        <w:ind w:left="360"/>
+      </w:pPr>
       <w:r>
         <w:rPr>
           <w:rFonts w:ascii="Courier New" w:eastAsia="Courier New" w:hAnsi="Courier New" w:cs="Courier New"/>
@@ -9719,9 +8783,15 @@
           <w:sz w:val="18"/>
           <w:szCs w:val="18"/>
         </w:rPr>
-        <w:t xml:space="preserve">&lt;8 | </w:t>
-      </w:r>
-      <w:proofErr w:type="gramStart"/>
+        <w:t xml:space="preserve">  diagnosticpage.h     ← diagnostics page HTML</w:t>
+      </w:r>
+    </w:p>
+    <w:p/>
+    <w:p>
+      <w:pPr>
+        <w:spacing w:after="80"/>
+        <w:ind w:left="360"/>
+      </w:pPr>
       <w:r>
         <w:rPr>
           <w:rFonts w:ascii="Courier New" w:eastAsia="Courier New" w:hAnsi="Courier New" w:cs="Courier New"/>
@@ -9729,9 +8799,14 @@
           <w:sz w:val="18"/>
           <w:szCs w:val="18"/>
         </w:rPr>
-        <w:t>bytes[</w:t>
-      </w:r>
-      <w:proofErr w:type="gramEnd"/>
+        <w:t>can_sniffer/</w:t>
+      </w:r>
+    </w:p>
+    <w:p>
+      <w:pPr>
+        <w:spacing w:after="80"/>
+        <w:ind w:left="360"/>
+      </w:pPr>
       <w:r>
         <w:rPr>
           <w:rFonts w:ascii="Courier New" w:eastAsia="Courier New" w:hAnsi="Courier New" w:cs="Courier New"/>
@@ -9739,900 +8814,14 @@
           <w:sz w:val="18"/>
           <w:szCs w:val="18"/>
         </w:rPr>
-        <w:t>5]) × 0.5          // RPM</w:t>
-      </w:r>
-    </w:p>
-    <w:p>
-      <w:pPr>
-        <w:spacing w:after="80"/>
-        <w:ind w:left="360"/>
-      </w:pPr>
-      <w:r>
-        <w:rPr>
-          <w:rFonts w:ascii="Courier New" w:eastAsia="Courier New" w:hAnsi="Courier New" w:cs="Courier New"/>
-          <w:color w:val="C7254E"/>
-          <w:sz w:val="18"/>
-          <w:szCs w:val="18"/>
-        </w:rPr>
-        <w:t>error   = (</w:t>
-      </w:r>
-      <w:proofErr w:type="gramStart"/>
-      <w:r>
-        <w:rPr>
-          <w:rFonts w:ascii="Courier New" w:eastAsia="Courier New" w:hAnsi="Courier New" w:cs="Courier New"/>
-          <w:color w:val="C7254E"/>
-          <w:sz w:val="18"/>
-          <w:szCs w:val="18"/>
-        </w:rPr>
-        <w:t>bytes[</w:t>
-      </w:r>
-      <w:proofErr w:type="gramEnd"/>
-      <w:r>
-        <w:rPr>
-          <w:rFonts w:ascii="Courier New" w:eastAsia="Courier New" w:hAnsi="Courier New" w:cs="Courier New"/>
-          <w:color w:val="C7254E"/>
-          <w:sz w:val="18"/>
-          <w:szCs w:val="18"/>
-        </w:rPr>
-        <w:t>6] &amp; 0xB0</w:t>
-      </w:r>
-      <w:proofErr w:type="gramStart"/>
-      <w:r>
-        <w:rPr>
-          <w:rFonts w:ascii="Courier New" w:eastAsia="Courier New" w:hAnsi="Courier New" w:cs="Courier New"/>
-          <w:color w:val="C7254E"/>
-          <w:sz w:val="18"/>
-          <w:szCs w:val="18"/>
-        </w:rPr>
-        <w:t>) !</w:t>
-      </w:r>
-      <w:proofErr w:type="gramEnd"/>
-      <w:r>
-        <w:rPr>
-          <w:rFonts w:ascii="Courier New" w:eastAsia="Courier New" w:hAnsi="Courier New" w:cs="Courier New"/>
-          <w:color w:val="C7254E"/>
-          <w:sz w:val="18"/>
-          <w:szCs w:val="18"/>
-        </w:rPr>
-        <w:t>= 0x00                    // fault flags</w:t>
+        <w:t xml:space="preserve">  can_sniffer.ino      ← separate sketch for CAN bus debugging</w:t>
       </w:r>
     </w:p>
     <w:p/>
     <w:p>
       <w:pPr>
-        <w:pStyle w:val="Heading3"/>
-      </w:pPr>
-      <w:r>
-        <w:t>0x55A / 1370</w:t>
-      </w:r>
-    </w:p>
-    <w:p>
-      <w:pPr>
-        <w:spacing w:after="80"/>
-        <w:ind w:left="360"/>
-      </w:pPr>
-      <w:proofErr w:type="spellStart"/>
-      <w:r>
-        <w:rPr>
-          <w:rFonts w:ascii="Courier New" w:eastAsia="Courier New" w:hAnsi="Courier New" w:cs="Courier New"/>
-          <w:color w:val="C7254E"/>
-          <w:sz w:val="18"/>
-          <w:szCs w:val="18"/>
-        </w:rPr>
-        <w:t>motor_temp_c</w:t>
-      </w:r>
-      <w:proofErr w:type="spellEnd"/>
-      <w:r>
-        <w:rPr>
-          <w:rFonts w:ascii="Courier New" w:eastAsia="Courier New" w:hAnsi="Courier New" w:cs="Courier New"/>
-          <w:color w:val="C7254E"/>
-          <w:sz w:val="18"/>
-          <w:szCs w:val="18"/>
-        </w:rPr>
-        <w:t xml:space="preserve">    = </w:t>
-      </w:r>
-      <w:proofErr w:type="spellStart"/>
-      <w:r>
-        <w:rPr>
-          <w:rFonts w:ascii="Courier New" w:eastAsia="Courier New" w:hAnsi="Courier New" w:cs="Courier New"/>
-          <w:color w:val="C7254E"/>
-          <w:sz w:val="18"/>
-          <w:szCs w:val="18"/>
-        </w:rPr>
-        <w:t>fahrenheit_to_celsius</w:t>
-      </w:r>
-      <w:proofErr w:type="spellEnd"/>
-      <w:r>
-        <w:rPr>
-          <w:rFonts w:ascii="Courier New" w:eastAsia="Courier New" w:hAnsi="Courier New" w:cs="Courier New"/>
-          <w:color w:val="C7254E"/>
-          <w:sz w:val="18"/>
-          <w:szCs w:val="18"/>
-        </w:rPr>
-        <w:t>(</w:t>
-      </w:r>
-      <w:proofErr w:type="gramStart"/>
-      <w:r>
-        <w:rPr>
-          <w:rFonts w:ascii="Courier New" w:eastAsia="Courier New" w:hAnsi="Courier New" w:cs="Courier New"/>
-          <w:color w:val="C7254E"/>
-          <w:sz w:val="18"/>
-          <w:szCs w:val="18"/>
-        </w:rPr>
-        <w:t>bytes[</w:t>
-      </w:r>
-      <w:proofErr w:type="gramEnd"/>
-      <w:r>
-        <w:rPr>
-          <w:rFonts w:ascii="Courier New" w:eastAsia="Courier New" w:hAnsi="Courier New" w:cs="Courier New"/>
-          <w:color w:val="C7254E"/>
-          <w:sz w:val="18"/>
-          <w:szCs w:val="18"/>
-        </w:rPr>
-        <w:t>1])</w:t>
-      </w:r>
-    </w:p>
-    <w:p>
-      <w:pPr>
-        <w:spacing w:after="80"/>
-        <w:ind w:left="360"/>
-      </w:pPr>
-      <w:proofErr w:type="spellStart"/>
-      <w:r>
-        <w:rPr>
-          <w:rFonts w:ascii="Courier New" w:eastAsia="Courier New" w:hAnsi="Courier New" w:cs="Courier New"/>
-          <w:color w:val="C7254E"/>
-          <w:sz w:val="18"/>
-          <w:szCs w:val="18"/>
-        </w:rPr>
-        <w:t>inverter_temp_c</w:t>
-      </w:r>
-      <w:proofErr w:type="spellEnd"/>
-      <w:r>
-        <w:rPr>
-          <w:rFonts w:ascii="Courier New" w:eastAsia="Courier New" w:hAnsi="Courier New" w:cs="Courier New"/>
-          <w:color w:val="C7254E"/>
-          <w:sz w:val="18"/>
-          <w:szCs w:val="18"/>
-        </w:rPr>
-        <w:t xml:space="preserve"> = </w:t>
-      </w:r>
-      <w:proofErr w:type="spellStart"/>
-      <w:r>
-        <w:rPr>
-          <w:rFonts w:ascii="Courier New" w:eastAsia="Courier New" w:hAnsi="Courier New" w:cs="Courier New"/>
-          <w:color w:val="C7254E"/>
-          <w:sz w:val="18"/>
-          <w:szCs w:val="18"/>
-        </w:rPr>
-        <w:t>fahrenheit_to_celsius</w:t>
-      </w:r>
-      <w:proofErr w:type="spellEnd"/>
-      <w:r>
-        <w:rPr>
-          <w:rFonts w:ascii="Courier New" w:eastAsia="Courier New" w:hAnsi="Courier New" w:cs="Courier New"/>
-          <w:color w:val="C7254E"/>
-          <w:sz w:val="18"/>
-          <w:szCs w:val="18"/>
-        </w:rPr>
-        <w:t>(</w:t>
-      </w:r>
-      <w:proofErr w:type="gramStart"/>
-      <w:r>
-        <w:rPr>
-          <w:rFonts w:ascii="Courier New" w:eastAsia="Courier New" w:hAnsi="Courier New" w:cs="Courier New"/>
-          <w:color w:val="C7254E"/>
-          <w:sz w:val="18"/>
-          <w:szCs w:val="18"/>
-        </w:rPr>
-        <w:t>bytes[</w:t>
-      </w:r>
-      <w:proofErr w:type="gramEnd"/>
-      <w:r>
-        <w:rPr>
-          <w:rFonts w:ascii="Courier New" w:eastAsia="Courier New" w:hAnsi="Courier New" w:cs="Courier New"/>
-          <w:color w:val="C7254E"/>
-          <w:sz w:val="18"/>
-          <w:szCs w:val="18"/>
-        </w:rPr>
-        <w:t>2])</w:t>
-      </w:r>
-    </w:p>
-    <w:p/>
-    <w:p>
-      <w:pPr>
-        <w:pStyle w:val="Heading3"/>
-      </w:pPr>
-      <w:r>
-        <w:t>0x55B / 1371</w:t>
-      </w:r>
-    </w:p>
-    <w:p>
-      <w:pPr>
-        <w:spacing w:after="80"/>
-        <w:ind w:left="360"/>
-      </w:pPr>
-      <w:r>
-        <w:rPr>
-          <w:rFonts w:ascii="Courier New" w:eastAsia="Courier New" w:hAnsi="Courier New" w:cs="Courier New"/>
-          <w:color w:val="C7254E"/>
-          <w:sz w:val="18"/>
-          <w:szCs w:val="18"/>
-        </w:rPr>
-        <w:t>soc = ((</w:t>
-      </w:r>
-      <w:proofErr w:type="gramStart"/>
-      <w:r>
-        <w:rPr>
-          <w:rFonts w:ascii="Courier New" w:eastAsia="Courier New" w:hAnsi="Courier New" w:cs="Courier New"/>
-          <w:color w:val="C7254E"/>
-          <w:sz w:val="18"/>
-          <w:szCs w:val="18"/>
-        </w:rPr>
-        <w:t>bytes[0]&lt;</w:t>
-      </w:r>
-      <w:proofErr w:type="gramEnd"/>
-      <w:r>
-        <w:rPr>
-          <w:rFonts w:ascii="Courier New" w:eastAsia="Courier New" w:hAnsi="Courier New" w:cs="Courier New"/>
-          <w:color w:val="C7254E"/>
-          <w:sz w:val="18"/>
-          <w:szCs w:val="18"/>
-        </w:rPr>
-        <w:t>&lt;2) | (</w:t>
-      </w:r>
-      <w:proofErr w:type="gramStart"/>
-      <w:r>
-        <w:rPr>
-          <w:rFonts w:ascii="Courier New" w:eastAsia="Courier New" w:hAnsi="Courier New" w:cs="Courier New"/>
-          <w:color w:val="C7254E"/>
-          <w:sz w:val="18"/>
-          <w:szCs w:val="18"/>
-        </w:rPr>
-        <w:t>bytes[</w:t>
-      </w:r>
-      <w:proofErr w:type="gramEnd"/>
-      <w:r>
-        <w:rPr>
-          <w:rFonts w:ascii="Courier New" w:eastAsia="Courier New" w:hAnsi="Courier New" w:cs="Courier New"/>
-          <w:color w:val="C7254E"/>
-          <w:sz w:val="18"/>
-          <w:szCs w:val="18"/>
-        </w:rPr>
-        <w:t xml:space="preserve">1]&gt;&gt;6)) × 0.1   // </w:t>
-      </w:r>
-      <w:proofErr w:type="gramStart"/>
-      <w:r>
-        <w:rPr>
-          <w:rFonts w:ascii="Courier New" w:eastAsia="Courier New" w:hAnsi="Courier New" w:cs="Courier New"/>
-          <w:color w:val="C7254E"/>
-          <w:sz w:val="18"/>
-          <w:szCs w:val="18"/>
-        </w:rPr>
-        <w:t>%  (</w:t>
-      </w:r>
-      <w:proofErr w:type="gramEnd"/>
-      <w:r>
-        <w:rPr>
-          <w:rFonts w:ascii="Courier New" w:eastAsia="Courier New" w:hAnsi="Courier New" w:cs="Courier New"/>
-          <w:color w:val="C7254E"/>
-          <w:sz w:val="18"/>
-          <w:szCs w:val="18"/>
-        </w:rPr>
-        <w:t>25% = raw 250 = 0x00FA)</w:t>
-      </w:r>
-    </w:p>
-    <w:p/>
-    <w:p>
-      <w:pPr>
-        <w:pStyle w:val="Heading3"/>
-      </w:pPr>
-      <w:r>
-        <w:t>0x1DB / 475</w:t>
-      </w:r>
-    </w:p>
-    <w:p>
-      <w:pPr>
-        <w:spacing w:after="80"/>
-        <w:ind w:left="360"/>
-      </w:pPr>
-      <w:r>
-        <w:rPr>
-          <w:rFonts w:ascii="Courier New" w:eastAsia="Courier New" w:hAnsi="Courier New" w:cs="Courier New"/>
-          <w:color w:val="C7254E"/>
-          <w:sz w:val="18"/>
-          <w:szCs w:val="18"/>
-        </w:rPr>
-        <w:t>cur = ((</w:t>
-      </w:r>
-      <w:proofErr w:type="gramStart"/>
-      <w:r>
-        <w:rPr>
-          <w:rFonts w:ascii="Courier New" w:eastAsia="Courier New" w:hAnsi="Courier New" w:cs="Courier New"/>
-          <w:color w:val="C7254E"/>
-          <w:sz w:val="18"/>
-          <w:szCs w:val="18"/>
-        </w:rPr>
-        <w:t>bytes[0]&lt;</w:t>
-      </w:r>
-      <w:proofErr w:type="gramEnd"/>
-      <w:r>
-        <w:rPr>
-          <w:rFonts w:ascii="Courier New" w:eastAsia="Courier New" w:hAnsi="Courier New" w:cs="Courier New"/>
-          <w:color w:val="C7254E"/>
-          <w:sz w:val="18"/>
-          <w:szCs w:val="18"/>
-        </w:rPr>
-        <w:t>&lt;3) | (</w:t>
-      </w:r>
-      <w:proofErr w:type="gramStart"/>
-      <w:r>
-        <w:rPr>
-          <w:rFonts w:ascii="Courier New" w:eastAsia="Courier New" w:hAnsi="Courier New" w:cs="Courier New"/>
-          <w:color w:val="C7254E"/>
-          <w:sz w:val="18"/>
-          <w:szCs w:val="18"/>
-        </w:rPr>
-        <w:t>bytes[</w:t>
-      </w:r>
-      <w:proofErr w:type="gramEnd"/>
-      <w:r>
-        <w:rPr>
-          <w:rFonts w:ascii="Courier New" w:eastAsia="Courier New" w:hAnsi="Courier New" w:cs="Courier New"/>
-          <w:color w:val="C7254E"/>
-          <w:sz w:val="18"/>
-          <w:szCs w:val="18"/>
-        </w:rPr>
-        <w:t>1]&gt;&gt;5))</w:t>
-      </w:r>
-    </w:p>
-    <w:p>
-      <w:pPr>
-        <w:spacing w:after="80"/>
-        <w:ind w:left="360"/>
-      </w:pPr>
-      <w:r>
-        <w:rPr>
-          <w:rFonts w:ascii="Courier New" w:eastAsia="Courier New" w:hAnsi="Courier New" w:cs="Courier New"/>
-          <w:color w:val="C7254E"/>
-          <w:sz w:val="18"/>
-          <w:szCs w:val="18"/>
-        </w:rPr>
-        <w:t>if (cur &gt; 1023) cur -= 2047   // 11-bit signed correction</w:t>
-      </w:r>
-    </w:p>
-    <w:p/>
-    <w:p>
-      <w:pPr>
-        <w:pStyle w:val="Heading3"/>
-      </w:pPr>
-      <w:r>
-        <w:t>0x390 / 912</w:t>
-      </w:r>
-    </w:p>
-    <w:p>
-      <w:pPr>
-        <w:spacing w:after="80"/>
-        <w:ind w:left="360"/>
-      </w:pPr>
-      <w:proofErr w:type="spellStart"/>
-      <w:r>
-        <w:rPr>
-          <w:rFonts w:ascii="Courier New" w:eastAsia="Courier New" w:hAnsi="Courier New" w:cs="Courier New"/>
-          <w:color w:val="C7254E"/>
-          <w:sz w:val="18"/>
-          <w:szCs w:val="18"/>
-        </w:rPr>
-        <w:t>OBCVoltStat</w:t>
-      </w:r>
-      <w:proofErr w:type="spellEnd"/>
-      <w:r>
-        <w:rPr>
-          <w:rFonts w:ascii="Courier New" w:eastAsia="Courier New" w:hAnsi="Courier New" w:cs="Courier New"/>
-          <w:color w:val="C7254E"/>
-          <w:sz w:val="18"/>
-          <w:szCs w:val="18"/>
-        </w:rPr>
-        <w:t xml:space="preserve"> = (</w:t>
-      </w:r>
-      <w:proofErr w:type="gramStart"/>
-      <w:r>
-        <w:rPr>
-          <w:rFonts w:ascii="Courier New" w:eastAsia="Courier New" w:hAnsi="Courier New" w:cs="Courier New"/>
-          <w:color w:val="C7254E"/>
-          <w:sz w:val="18"/>
-          <w:szCs w:val="18"/>
-        </w:rPr>
-        <w:t>bytes[</w:t>
-      </w:r>
-      <w:proofErr w:type="gramEnd"/>
-      <w:r>
-        <w:rPr>
-          <w:rFonts w:ascii="Courier New" w:eastAsia="Courier New" w:hAnsi="Courier New" w:cs="Courier New"/>
-          <w:color w:val="C7254E"/>
-          <w:sz w:val="18"/>
-          <w:szCs w:val="18"/>
-        </w:rPr>
-        <w:t>3]&gt;&gt;3) &amp; 0x03</w:t>
-      </w:r>
-    </w:p>
-    <w:p>
-      <w:pPr>
-        <w:spacing w:after="80"/>
-        <w:ind w:left="360"/>
-      </w:pPr>
-      <w:proofErr w:type="spellStart"/>
-      <w:r>
-        <w:rPr>
-          <w:rFonts w:ascii="Courier New" w:eastAsia="Courier New" w:hAnsi="Courier New" w:cs="Courier New"/>
-          <w:color w:val="C7254E"/>
-          <w:sz w:val="18"/>
-          <w:szCs w:val="18"/>
-        </w:rPr>
-        <w:t>PlugStat</w:t>
-      </w:r>
-      <w:proofErr w:type="spellEnd"/>
-      <w:r>
-        <w:rPr>
-          <w:rFonts w:ascii="Courier New" w:eastAsia="Courier New" w:hAnsi="Courier New" w:cs="Courier New"/>
-          <w:color w:val="C7254E"/>
-          <w:sz w:val="18"/>
-          <w:szCs w:val="18"/>
-        </w:rPr>
-        <w:t xml:space="preserve">    = </w:t>
-      </w:r>
-      <w:proofErr w:type="gramStart"/>
-      <w:r>
-        <w:rPr>
-          <w:rFonts w:ascii="Courier New" w:eastAsia="Courier New" w:hAnsi="Courier New" w:cs="Courier New"/>
-          <w:color w:val="C7254E"/>
-          <w:sz w:val="18"/>
-          <w:szCs w:val="18"/>
-        </w:rPr>
-        <w:t>bytes[</w:t>
-      </w:r>
-      <w:proofErr w:type="gramEnd"/>
-      <w:r>
-        <w:rPr>
-          <w:rFonts w:ascii="Courier New" w:eastAsia="Courier New" w:hAnsi="Courier New" w:cs="Courier New"/>
-          <w:color w:val="C7254E"/>
-          <w:sz w:val="18"/>
-          <w:szCs w:val="18"/>
-        </w:rPr>
-        <w:t>5] &amp; 0x0F   // 0x08 = plugged in</w:t>
-      </w:r>
-    </w:p>
-    <w:p/>
-    <w:p>
-      <w:pPr>
-        <w:pStyle w:val="Heading3"/>
-      </w:pPr>
-      <w:r>
-        <w:t xml:space="preserve">0x31A / </w:t>
-      </w:r>
-      <w:proofErr w:type="gramStart"/>
-      <w:r>
-        <w:t>794  (</w:t>
-      </w:r>
-      <w:proofErr w:type="spellStart"/>
-      <w:proofErr w:type="gramEnd"/>
-      <w:r>
-        <w:t>ZombieVerter</w:t>
-      </w:r>
-      <w:proofErr w:type="spellEnd"/>
-      <w:r>
-        <w:t xml:space="preserve"> TX)</w:t>
-      </w:r>
-    </w:p>
-    <w:p>
-      <w:pPr>
-        <w:spacing w:after="80"/>
-        <w:ind w:left="360"/>
-      </w:pPr>
-      <w:proofErr w:type="spellStart"/>
-      <w:r>
-        <w:rPr>
-          <w:rFonts w:ascii="Courier New" w:eastAsia="Courier New" w:hAnsi="Courier New" w:cs="Courier New"/>
-          <w:color w:val="C7254E"/>
-          <w:sz w:val="18"/>
-          <w:szCs w:val="18"/>
-        </w:rPr>
-        <w:t>drivedir</w:t>
-      </w:r>
-      <w:proofErr w:type="spellEnd"/>
-      <w:r>
-        <w:rPr>
-          <w:rFonts w:ascii="Courier New" w:eastAsia="Courier New" w:hAnsi="Courier New" w:cs="Courier New"/>
-          <w:color w:val="C7254E"/>
-          <w:sz w:val="18"/>
-          <w:szCs w:val="18"/>
-        </w:rPr>
-        <w:t xml:space="preserve"> = int8(</w:t>
-      </w:r>
-      <w:proofErr w:type="gramStart"/>
-      <w:r>
-        <w:rPr>
-          <w:rFonts w:ascii="Courier New" w:eastAsia="Courier New" w:hAnsi="Courier New" w:cs="Courier New"/>
-          <w:color w:val="C7254E"/>
-          <w:sz w:val="18"/>
-          <w:szCs w:val="18"/>
-        </w:rPr>
-        <w:t>bytes[</w:t>
-      </w:r>
-      <w:proofErr w:type="gramEnd"/>
-      <w:r>
-        <w:rPr>
-          <w:rFonts w:ascii="Courier New" w:eastAsia="Courier New" w:hAnsi="Courier New" w:cs="Courier New"/>
-          <w:color w:val="C7254E"/>
-          <w:sz w:val="18"/>
-          <w:szCs w:val="18"/>
-        </w:rPr>
-        <w:t>0</w:t>
-      </w:r>
-      <w:proofErr w:type="gramStart"/>
-      <w:r>
-        <w:rPr>
-          <w:rFonts w:ascii="Courier New" w:eastAsia="Courier New" w:hAnsi="Courier New" w:cs="Courier New"/>
-          <w:color w:val="C7254E"/>
-          <w:sz w:val="18"/>
-          <w:szCs w:val="18"/>
-        </w:rPr>
-        <w:t xml:space="preserve">])   </w:t>
-      </w:r>
-      <w:proofErr w:type="gramEnd"/>
-      <w:r>
-        <w:rPr>
-          <w:rFonts w:ascii="Courier New" w:eastAsia="Courier New" w:hAnsi="Courier New" w:cs="Courier New"/>
-          <w:color w:val="C7254E"/>
-          <w:sz w:val="18"/>
-          <w:szCs w:val="18"/>
-        </w:rPr>
-        <w:t>// -1=</w:t>
-      </w:r>
-      <w:proofErr w:type="gramStart"/>
-      <w:r>
-        <w:rPr>
-          <w:rFonts w:ascii="Courier New" w:eastAsia="Courier New" w:hAnsi="Courier New" w:cs="Courier New"/>
-          <w:color w:val="C7254E"/>
-          <w:sz w:val="18"/>
-          <w:szCs w:val="18"/>
-        </w:rPr>
-        <w:t>Reverse  0</w:t>
-      </w:r>
-      <w:proofErr w:type="gramEnd"/>
-      <w:r>
-        <w:rPr>
-          <w:rFonts w:ascii="Courier New" w:eastAsia="Courier New" w:hAnsi="Courier New" w:cs="Courier New"/>
-          <w:color w:val="C7254E"/>
-          <w:sz w:val="18"/>
-          <w:szCs w:val="18"/>
-        </w:rPr>
-        <w:t>=</w:t>
-      </w:r>
-      <w:proofErr w:type="gramStart"/>
-      <w:r>
-        <w:rPr>
-          <w:rFonts w:ascii="Courier New" w:eastAsia="Courier New" w:hAnsi="Courier New" w:cs="Courier New"/>
-          <w:color w:val="C7254E"/>
-          <w:sz w:val="18"/>
-          <w:szCs w:val="18"/>
-        </w:rPr>
-        <w:t>Neutral  1</w:t>
-      </w:r>
-      <w:proofErr w:type="gramEnd"/>
-      <w:r>
-        <w:rPr>
-          <w:rFonts w:ascii="Courier New" w:eastAsia="Courier New" w:hAnsi="Courier New" w:cs="Courier New"/>
-          <w:color w:val="C7254E"/>
-          <w:sz w:val="18"/>
-          <w:szCs w:val="18"/>
-        </w:rPr>
-        <w:t>=Forward</w:t>
-      </w:r>
-    </w:p>
-    <w:p>
-      <w:pPr>
-        <w:spacing w:after="80"/>
-        <w:ind w:left="360"/>
-      </w:pPr>
-      <w:proofErr w:type="spellStart"/>
-      <w:r>
-        <w:rPr>
-          <w:rFonts w:ascii="Courier New" w:eastAsia="Courier New" w:hAnsi="Courier New" w:cs="Courier New"/>
-          <w:color w:val="C7254E"/>
-          <w:sz w:val="18"/>
-          <w:szCs w:val="18"/>
-        </w:rPr>
-        <w:t>opmode</w:t>
-      </w:r>
-      <w:proofErr w:type="spellEnd"/>
-      <w:r>
-        <w:rPr>
-          <w:rFonts w:ascii="Courier New" w:eastAsia="Courier New" w:hAnsi="Courier New" w:cs="Courier New"/>
-          <w:color w:val="C7254E"/>
-          <w:sz w:val="18"/>
-          <w:szCs w:val="18"/>
-        </w:rPr>
-        <w:t xml:space="preserve">   = int8(</w:t>
-      </w:r>
-      <w:proofErr w:type="gramStart"/>
-      <w:r>
-        <w:rPr>
-          <w:rFonts w:ascii="Courier New" w:eastAsia="Courier New" w:hAnsi="Courier New" w:cs="Courier New"/>
-          <w:color w:val="C7254E"/>
-          <w:sz w:val="18"/>
-          <w:szCs w:val="18"/>
-        </w:rPr>
-        <w:t>bytes[</w:t>
-      </w:r>
-      <w:proofErr w:type="gramEnd"/>
-      <w:r>
-        <w:rPr>
-          <w:rFonts w:ascii="Courier New" w:eastAsia="Courier New" w:hAnsi="Courier New" w:cs="Courier New"/>
-          <w:color w:val="C7254E"/>
-          <w:sz w:val="18"/>
-          <w:szCs w:val="18"/>
-        </w:rPr>
-        <w:t>1</w:t>
-      </w:r>
-      <w:proofErr w:type="gramStart"/>
-      <w:r>
-        <w:rPr>
-          <w:rFonts w:ascii="Courier New" w:eastAsia="Courier New" w:hAnsi="Courier New" w:cs="Courier New"/>
-          <w:color w:val="C7254E"/>
-          <w:sz w:val="18"/>
-          <w:szCs w:val="18"/>
-        </w:rPr>
-        <w:t xml:space="preserve">])   </w:t>
-      </w:r>
-      <w:proofErr w:type="gramEnd"/>
-      <w:r>
-        <w:rPr>
-          <w:rFonts w:ascii="Courier New" w:eastAsia="Courier New" w:hAnsi="Courier New" w:cs="Courier New"/>
-          <w:color w:val="C7254E"/>
-          <w:sz w:val="18"/>
-          <w:szCs w:val="18"/>
-        </w:rPr>
-        <w:t>// 0=Off 1=Run 2=</w:t>
-      </w:r>
-      <w:proofErr w:type="spellStart"/>
-      <w:r>
-        <w:rPr>
-          <w:rFonts w:ascii="Courier New" w:eastAsia="Courier New" w:hAnsi="Courier New" w:cs="Courier New"/>
-          <w:color w:val="C7254E"/>
-          <w:sz w:val="18"/>
-          <w:szCs w:val="18"/>
-        </w:rPr>
-        <w:t>PreCharge</w:t>
-      </w:r>
-      <w:proofErr w:type="spellEnd"/>
-      <w:r>
-        <w:rPr>
-          <w:rFonts w:ascii="Courier New" w:eastAsia="Courier New" w:hAnsi="Courier New" w:cs="Courier New"/>
-          <w:color w:val="C7254E"/>
-          <w:sz w:val="18"/>
-          <w:szCs w:val="18"/>
-        </w:rPr>
-        <w:t xml:space="preserve"> 3=Fail 4=Charging</w:t>
-      </w:r>
-    </w:p>
-    <w:p/>
-    <w:p>
-      <w:pPr>
-        <w:pStyle w:val="Heading1"/>
-      </w:pPr>
-      <w:r>
-        <w:lastRenderedPageBreak/>
-        <w:t>12</w:t>
-      </w:r>
-      <w:proofErr w:type="gramStart"/>
-      <w:r>
-        <w:t>.  Code</w:t>
-      </w:r>
-      <w:proofErr w:type="gramEnd"/>
-      <w:r>
-        <w:t xml:space="preserve"> File Structure</w:t>
-      </w:r>
-    </w:p>
-    <w:p>
-      <w:pPr>
-        <w:spacing w:after="80"/>
-        <w:ind w:left="360"/>
-      </w:pPr>
-      <w:proofErr w:type="spellStart"/>
-      <w:r>
-        <w:rPr>
-          <w:rFonts w:ascii="Courier New" w:eastAsia="Courier New" w:hAnsi="Courier New" w:cs="Courier New"/>
-          <w:color w:val="C7254E"/>
-          <w:sz w:val="18"/>
-          <w:szCs w:val="18"/>
-        </w:rPr>
-        <w:t>ev_dashboard</w:t>
-      </w:r>
-      <w:proofErr w:type="spellEnd"/>
-      <w:r>
-        <w:rPr>
-          <w:rFonts w:ascii="Courier New" w:eastAsia="Courier New" w:hAnsi="Courier New" w:cs="Courier New"/>
-          <w:color w:val="C7254E"/>
-          <w:sz w:val="18"/>
-          <w:szCs w:val="18"/>
-        </w:rPr>
-        <w:t>/</w:t>
-      </w:r>
-    </w:p>
-    <w:p>
-      <w:pPr>
-        <w:spacing w:after="80"/>
-        <w:ind w:left="360"/>
-      </w:pPr>
-      <w:r>
-        <w:rPr>
-          <w:rFonts w:ascii="Courier New" w:eastAsia="Courier New" w:hAnsi="Courier New" w:cs="Courier New"/>
-          <w:color w:val="C7254E"/>
-          <w:sz w:val="18"/>
-          <w:szCs w:val="18"/>
-        </w:rPr>
-        <w:t xml:space="preserve">  </w:t>
-      </w:r>
-      <w:proofErr w:type="spellStart"/>
-      <w:r>
-        <w:rPr>
-          <w:rFonts w:ascii="Courier New" w:eastAsia="Courier New" w:hAnsi="Courier New" w:cs="Courier New"/>
-          <w:color w:val="C7254E"/>
-          <w:sz w:val="18"/>
-          <w:szCs w:val="18"/>
-        </w:rPr>
-        <w:t>ev_dashboard.ino</w:t>
-      </w:r>
-      <w:proofErr w:type="spellEnd"/>
-      <w:r>
-        <w:rPr>
-          <w:rFonts w:ascii="Courier New" w:eastAsia="Courier New" w:hAnsi="Courier New" w:cs="Courier New"/>
-          <w:color w:val="C7254E"/>
-          <w:sz w:val="18"/>
-          <w:szCs w:val="18"/>
-        </w:rPr>
-        <w:t xml:space="preserve">     ← main sketch — open this in Arduino IDE</w:t>
-      </w:r>
-    </w:p>
-    <w:p>
-      <w:pPr>
-        <w:spacing w:after="80"/>
-        <w:ind w:left="360"/>
-      </w:pPr>
-      <w:r>
-        <w:rPr>
-          <w:rFonts w:ascii="Courier New" w:eastAsia="Courier New" w:hAnsi="Courier New" w:cs="Courier New"/>
-          <w:color w:val="C7254E"/>
-          <w:sz w:val="18"/>
-          <w:szCs w:val="18"/>
-        </w:rPr>
-        <w:t xml:space="preserve">  </w:t>
-      </w:r>
-      <w:proofErr w:type="spellStart"/>
-      <w:r>
-        <w:rPr>
-          <w:rFonts w:ascii="Courier New" w:eastAsia="Courier New" w:hAnsi="Courier New" w:cs="Courier New"/>
-          <w:color w:val="C7254E"/>
-          <w:sz w:val="18"/>
-          <w:szCs w:val="18"/>
-        </w:rPr>
-        <w:t>driverpage.h</w:t>
-      </w:r>
-      <w:proofErr w:type="spellEnd"/>
-      <w:r>
-        <w:rPr>
-          <w:rFonts w:ascii="Courier New" w:eastAsia="Courier New" w:hAnsi="Courier New" w:cs="Courier New"/>
-          <w:color w:val="C7254E"/>
-          <w:sz w:val="18"/>
-          <w:szCs w:val="18"/>
-        </w:rPr>
-        <w:t xml:space="preserve">         ← driver dashboard HTML</w:t>
-      </w:r>
-    </w:p>
-    <w:p>
-      <w:pPr>
-        <w:spacing w:after="80"/>
-        <w:ind w:left="360"/>
-      </w:pPr>
-      <w:r>
-        <w:rPr>
-          <w:rFonts w:ascii="Courier New" w:eastAsia="Courier New" w:hAnsi="Courier New" w:cs="Courier New"/>
-          <w:color w:val="C7254E"/>
-          <w:sz w:val="18"/>
-          <w:szCs w:val="18"/>
-        </w:rPr>
-        <w:t xml:space="preserve">  </w:t>
-      </w:r>
-      <w:proofErr w:type="spellStart"/>
-      <w:r>
-        <w:rPr>
-          <w:rFonts w:ascii="Courier New" w:eastAsia="Courier New" w:hAnsi="Courier New" w:cs="Courier New"/>
-          <w:color w:val="C7254E"/>
-          <w:sz w:val="18"/>
-          <w:szCs w:val="18"/>
-        </w:rPr>
-        <w:t>diagnosticpage.h</w:t>
-      </w:r>
-      <w:proofErr w:type="spellEnd"/>
-      <w:r>
-        <w:rPr>
-          <w:rFonts w:ascii="Courier New" w:eastAsia="Courier New" w:hAnsi="Courier New" w:cs="Courier New"/>
-          <w:color w:val="C7254E"/>
-          <w:sz w:val="18"/>
-          <w:szCs w:val="18"/>
-        </w:rPr>
-        <w:t xml:space="preserve">     ← diagnostics page HTML</w:t>
-      </w:r>
-    </w:p>
-    <w:p/>
-    <w:p>
-      <w:pPr>
-        <w:spacing w:after="80"/>
-        <w:ind w:left="360"/>
-      </w:pPr>
-      <w:proofErr w:type="spellStart"/>
-      <w:r>
-        <w:rPr>
-          <w:rFonts w:ascii="Courier New" w:eastAsia="Courier New" w:hAnsi="Courier New" w:cs="Courier New"/>
-          <w:color w:val="C7254E"/>
-          <w:sz w:val="18"/>
-          <w:szCs w:val="18"/>
-        </w:rPr>
-        <w:t>can_sniffer</w:t>
-      </w:r>
-      <w:proofErr w:type="spellEnd"/>
-      <w:r>
-        <w:rPr>
-          <w:rFonts w:ascii="Courier New" w:eastAsia="Courier New" w:hAnsi="Courier New" w:cs="Courier New"/>
-          <w:color w:val="C7254E"/>
-          <w:sz w:val="18"/>
-          <w:szCs w:val="18"/>
-        </w:rPr>
-        <w:t>/</w:t>
-      </w:r>
-    </w:p>
-    <w:p>
-      <w:pPr>
-        <w:spacing w:after="80"/>
-        <w:ind w:left="360"/>
-      </w:pPr>
-      <w:r>
-        <w:rPr>
-          <w:rFonts w:ascii="Courier New" w:eastAsia="Courier New" w:hAnsi="Courier New" w:cs="Courier New"/>
-          <w:color w:val="C7254E"/>
-          <w:sz w:val="18"/>
-          <w:szCs w:val="18"/>
-        </w:rPr>
-        <w:t xml:space="preserve">  </w:t>
-      </w:r>
-      <w:proofErr w:type="spellStart"/>
-      <w:r>
-        <w:rPr>
-          <w:rFonts w:ascii="Courier New" w:eastAsia="Courier New" w:hAnsi="Courier New" w:cs="Courier New"/>
-          <w:color w:val="C7254E"/>
-          <w:sz w:val="18"/>
-          <w:szCs w:val="18"/>
-        </w:rPr>
-        <w:t>can_sniffer.ino</w:t>
-      </w:r>
-      <w:proofErr w:type="spellEnd"/>
-      <w:r>
-        <w:rPr>
-          <w:rFonts w:ascii="Courier New" w:eastAsia="Courier New" w:hAnsi="Courier New" w:cs="Courier New"/>
-          <w:color w:val="C7254E"/>
-          <w:sz w:val="18"/>
-          <w:szCs w:val="18"/>
-        </w:rPr>
-        <w:t xml:space="preserve">      ← separate sketch for CAN bus debugging</w:t>
-      </w:r>
-    </w:p>
-    <w:p/>
-    <w:p>
-      <w:pPr>
         <w:spacing w:after="120"/>
       </w:pPr>
-      <w:proofErr w:type="gramStart"/>
       <w:r>
         <w:rPr>
           <w:b/>
@@ -10641,9 +8830,265 @@
           <w:sz w:val="20"/>
           <w:szCs w:val="20"/>
         </w:rPr>
-        <w:t>⚠  Do</w:t>
-      </w:r>
-      <w:proofErr w:type="gramEnd"/>
+        <w:t>⚠  Do NOT place can_sniffer.ino inside the ev_dashboard folder.</w:t>
+      </w:r>
+    </w:p>
+    <w:p/>
+    <w:p>
+      <w:pPr>
+        <w:pStyle w:val="Heading1"/>
+      </w:pPr>
+      <w:r>
+        <w:t>13.  WiFi and Web Interface</w:t>
+      </w:r>
+    </w:p>
+    <w:p>
+      <w:pPr>
+        <w:spacing w:after="120"/>
+      </w:pPr>
+      <w:r>
+        <w:rPr>
+          <w:color w:val="000000"/>
+        </w:rPr>
+        <w:t>SSID:          ESP32-EV-Dashboard</w:t>
+      </w:r>
+    </w:p>
+    <w:p>
+      <w:pPr>
+        <w:spacing w:after="120"/>
+      </w:pPr>
+      <w:r>
+        <w:rPr>
+          <w:color w:val="000000"/>
+        </w:rPr>
+        <w:t>Password:      evdash1234</w:t>
+      </w:r>
+    </w:p>
+    <w:p>
+      <w:pPr>
+        <w:spacing w:after="120"/>
+      </w:pPr>
+      <w:r>
+        <w:rPr>
+          <w:color w:val="000000"/>
+        </w:rPr>
+        <w:t>Dashboard:     http://192.168.4.1/</w:t>
+      </w:r>
+    </w:p>
+    <w:p>
+      <w:pPr>
+        <w:spacing w:after="120"/>
+      </w:pPr>
+      <w:r>
+        <w:rPr>
+          <w:color w:val="000000"/>
+        </w:rPr>
+        <w:t>Diagnostics:   http://192.168.4.1/diagnostics</w:t>
+      </w:r>
+    </w:p>
+    <w:p>
+      <w:pPr>
+        <w:spacing w:after="120"/>
+      </w:pPr>
+      <w:r>
+        <w:rPr>
+          <w:color w:val="000000"/>
+        </w:rPr>
+        <w:t>API:           http://192.168.4.1/api/data   (JSON, 500ms poll)</w:t>
+      </w:r>
+    </w:p>
+    <w:p>
+      <w:pPr>
+        <w:spacing w:after="120"/>
+      </w:pPr>
+      <w:r>
+        <w:rPr>
+          <w:color w:val="000000"/>
+        </w:rPr>
+        <w:t>CAN Sniffer:   http://192.168.4.1/  (when can_sniffer.ino is loaded)</w:t>
+      </w:r>
+    </w:p>
+    <w:p/>
+    <w:p>
+      <w:pPr>
+        <w:pStyle w:val="Heading1"/>
+      </w:pPr>
+      <w:r>
+        <w:t>14.  Troubleshooting</w:t>
+      </w:r>
+    </w:p>
+    <w:p>
+      <w:pPr>
+        <w:pStyle w:val="Heading2"/>
+      </w:pPr>
+      <w:r>
+        <w:t>No data / all gauges show --</w:t>
+      </w:r>
+    </w:p>
+    <w:p>
+      <w:pPr>
+        <w:spacing w:after="120"/>
+      </w:pPr>
+      <w:r>
+        <w:rPr>
+          <w:color w:val="000000"/>
+        </w:rPr>
+        <w:t>1.  Check Serial Monitor (115200 baud) — TWAI Init OK should appear</w:t>
+      </w:r>
+    </w:p>
+    <w:p>
+      <w:pPr>
+        <w:spacing w:after="120"/>
+      </w:pPr>
+      <w:r>
+        <w:rPr>
+          <w:color w:val="000000"/>
+        </w:rPr>
+        <w:t>2.  Verify CANH/CANL not swapped at CN5</w:t>
+      </w:r>
+    </w:p>
+    <w:p>
+      <w:pPr>
+        <w:spacing w:after="120"/>
+      </w:pPr>
+      <w:r>
+        <w:rPr>
+          <w:color w:val="000000"/>
+        </w:rPr>
+        <w:t>3.  Check JP1+JP2 jumper configuration vs ZombieVerter termination</w:t>
+      </w:r>
+    </w:p>
+    <w:p>
+      <w:pPr>
+        <w:spacing w:after="120"/>
+      </w:pPr>
+      <w:r>
+        <w:rPr>
+          <w:color w:val="000000"/>
+        </w:rPr>
+        <w:t>4.  Flash can_sniffer.ino — connect to CAN_Sniffer WiFi, open http://192.168.4.1</w:t>
+      </w:r>
+    </w:p>
+    <w:p>
+      <w:pPr>
+        <w:spacing w:after="120"/>
+      </w:pPr>
+      <w:r>
+        <w:rPr>
+          <w:color w:val="000000"/>
+        </w:rPr>
+        <w:t>5.  If Total Frames = 0 → wiring or termination fault</w:t>
+      </w:r>
+    </w:p>
+    <w:p>
+      <w:pPr>
+        <w:spacing w:after="120"/>
+      </w:pPr>
+      <w:r>
+        <w:rPr>
+          <w:color w:val="000000"/>
+        </w:rPr>
+        <w:t>6.  If frames present but no 0x1DA/0x55A/0x55B → Leaf BMS not on CAN1 or wrong bus</w:t>
+      </w:r>
+    </w:p>
+    <w:p/>
+    <w:p>
+      <w:pPr>
+        <w:pStyle w:val="Heading2"/>
+      </w:pPr>
+      <w:r>
+        <w:t>Power LED off / no WiFi AP</w:t>
+      </w:r>
+    </w:p>
+    <w:p>
+      <w:pPr>
+        <w:spacing w:after="120"/>
+      </w:pPr>
+      <w:r>
+        <w:rPr>
+          <w:color w:val="000000"/>
+        </w:rPr>
+        <w:t>1.  Check 24V supply at CN4 and fuse FH1</w:t>
+      </w:r>
+    </w:p>
+    <w:p>
+      <w:pPr>
+        <w:spacing w:after="120"/>
+      </w:pPr>
+      <w:r>
+        <w:rPr>
+          <w:color w:val="000000"/>
+        </w:rPr>
+        <w:t>2.  Try USB-C alone — if WiFi appears, 24V supply is the issue</w:t>
+      </w:r>
+    </w:p>
+    <w:p>
+      <w:pPr>
+        <w:spacing w:after="120"/>
+      </w:pPr>
+      <w:r>
+        <w:rPr>
+          <w:color w:val="000000"/>
+        </w:rPr>
+        <w:t>3.  Check AP63205WU-7 output — should be 5.0V at H2 pin1</w:t>
+      </w:r>
+    </w:p>
+    <w:p/>
+    <w:p>
+      <w:pPr>
+        <w:pStyle w:val="Heading2"/>
+      </w:pPr>
+      <w:r>
+        <w:t>Upload fails via USB-C</w:t>
+      </w:r>
+    </w:p>
+    <w:p>
+      <w:pPr>
+        <w:spacing w:after="120"/>
+      </w:pPr>
+      <w:r>
+        <w:rPr>
+          <w:color w:val="000000"/>
+        </w:rPr>
+        <w:lastRenderedPageBreak/>
+        <w:t>1.  Install CH340 drivers if COM port not visible</w:t>
+      </w:r>
+    </w:p>
+    <w:p>
+      <w:pPr>
+        <w:spacing w:after="120"/>
+      </w:pPr>
+      <w:r>
+        <w:rPr>
+          <w:color w:val="000000"/>
+        </w:rPr>
+        <w:t>2.  Try manual bootloader mode (BOOT + RST)</w:t>
+      </w:r>
+    </w:p>
+    <w:p>
+      <w:pPr>
+        <w:spacing w:after="120"/>
+      </w:pPr>
+      <w:r>
+        <w:rPr>
+          <w:color w:val="000000"/>
+        </w:rPr>
+        <w:t>3.  Reduce upload speed to 460800 in Arduino IDE board settings</w:t>
+      </w:r>
+    </w:p>
+    <w:p/>
+    <w:p>
+      <w:pPr>
+        <w:pStyle w:val="Heading2"/>
+      </w:pPr>
+      <w:r>
+        <w:t>Known code issues (current version)</w:t>
+      </w:r>
+    </w:p>
+    <w:p>
+      <w:pPr>
+        <w:spacing w:after="120"/>
+      </w:pPr>
       <w:r>
         <w:rPr>
           <w:b/>
@@ -10652,9 +9097,13 @@
           <w:sz w:val="20"/>
           <w:szCs w:val="20"/>
         </w:rPr>
-        <w:t xml:space="preserve"> NOT place </w:t>
-      </w:r>
-      <w:proofErr w:type="spellStart"/>
+        <w:t>⚠  diagnosticpage.h has duplicate id='stateofcharge' and duplicate id='error' — second instance will not update in some browsers. Remove duplicate divs.</w:t>
+      </w:r>
+    </w:p>
+    <w:p>
+      <w:pPr>
+        <w:spacing w:after="120"/>
+      </w:pPr>
       <w:r>
         <w:rPr>
           <w:b/>
@@ -10663,843 +9112,20 @@
           <w:sz w:val="20"/>
           <w:szCs w:val="20"/>
         </w:rPr>
-        <w:t>can_sniffer.ino</w:t>
-      </w:r>
-      <w:proofErr w:type="spellEnd"/>
-      <w:r>
-        <w:rPr>
-          <w:b/>
-          <w:bCs/>
-          <w:color w:val="C00000"/>
-          <w:sz w:val="20"/>
-          <w:szCs w:val="20"/>
-        </w:rPr>
-        <w:t xml:space="preserve"> inside the </w:t>
-      </w:r>
-      <w:proofErr w:type="spellStart"/>
-      <w:r>
-        <w:rPr>
-          <w:b/>
-          <w:bCs/>
-          <w:color w:val="C00000"/>
-          <w:sz w:val="20"/>
-          <w:szCs w:val="20"/>
-        </w:rPr>
-        <w:t>ev_dashboard</w:t>
-      </w:r>
-      <w:proofErr w:type="spellEnd"/>
-      <w:r>
-        <w:rPr>
-          <w:b/>
-          <w:bCs/>
-          <w:color w:val="C00000"/>
-          <w:sz w:val="20"/>
-          <w:szCs w:val="20"/>
-        </w:rPr>
-        <w:t xml:space="preserve"> folder.</w:t>
-      </w:r>
-    </w:p>
-    <w:p/>
-    <w:p>
-      <w:pPr>
-        <w:pStyle w:val="Heading1"/>
-      </w:pPr>
-      <w:r>
-        <w:t>13</w:t>
-      </w:r>
-      <w:proofErr w:type="gramStart"/>
-      <w:r>
-        <w:t xml:space="preserve">.  </w:t>
-      </w:r>
-      <w:proofErr w:type="spellStart"/>
-      <w:r>
-        <w:t>WiFi</w:t>
-      </w:r>
-      <w:proofErr w:type="spellEnd"/>
-      <w:proofErr w:type="gramEnd"/>
-      <w:r>
-        <w:t xml:space="preserve"> and Web Interface</w:t>
+        <w:t>⚠  driverpage.h catch block references bare 'opmode' identifier — will throw ReferenceError. Remove 'opmode' from the catch line.</w:t>
       </w:r>
     </w:p>
     <w:p>
       <w:pPr>
         <w:spacing w:after="120"/>
       </w:pPr>
-      <w:r>
-        <w:rPr>
-          <w:color w:val="000000"/>
-        </w:rPr>
-        <w:t>SSID:          ESP32-EV-Dashboard</w:t>
-      </w:r>
-    </w:p>
-    <w:p>
-      <w:pPr>
-        <w:spacing w:after="120"/>
-      </w:pPr>
-      <w:r>
-        <w:rPr>
-          <w:color w:val="000000"/>
-        </w:rPr>
-        <w:t>Password:      evdash1234</w:t>
-      </w:r>
-    </w:p>
-    <w:p>
-      <w:pPr>
-        <w:spacing w:after="120"/>
-      </w:pPr>
-      <w:r>
-        <w:rPr>
-          <w:color w:val="000000"/>
-        </w:rPr>
-        <w:t>Dashboard:     http://192.168.4.1/</w:t>
-      </w:r>
-    </w:p>
-    <w:p>
-      <w:pPr>
-        <w:spacing w:after="120"/>
-      </w:pPr>
-      <w:r>
-        <w:rPr>
-          <w:color w:val="000000"/>
-        </w:rPr>
-        <w:t>Diagnostics:   http://192.168.4.1/diagnostics</w:t>
-      </w:r>
-    </w:p>
-    <w:p>
-      <w:pPr>
-        <w:spacing w:after="120"/>
-      </w:pPr>
-      <w:r>
-        <w:rPr>
-          <w:color w:val="000000"/>
-        </w:rPr>
-        <w:t>API:           http://192.168.4.1/api/data</w:t>
-      </w:r>
-      <w:proofErr w:type="gramStart"/>
-      <w:r>
-        <w:rPr>
-          <w:color w:val="000000"/>
-        </w:rPr>
-        <w:t xml:space="preserve">   (</w:t>
-      </w:r>
-      <w:proofErr w:type="gramEnd"/>
-      <w:r>
-        <w:rPr>
-          <w:color w:val="000000"/>
-        </w:rPr>
-        <w:t>JSON, 500ms poll)</w:t>
-      </w:r>
-    </w:p>
-    <w:p>
-      <w:pPr>
-        <w:spacing w:after="120"/>
-      </w:pPr>
-      <w:r>
-        <w:rPr>
-          <w:color w:val="000000"/>
-        </w:rPr>
-        <w:t xml:space="preserve">CAN Sniffer:   </w:t>
-      </w:r>
-      <w:proofErr w:type="gramStart"/>
-      <w:r>
-        <w:rPr>
-          <w:color w:val="000000"/>
-        </w:rPr>
-        <w:t>http://192.168.4.1/  (</w:t>
-      </w:r>
-      <w:proofErr w:type="gramEnd"/>
-      <w:r>
-        <w:rPr>
-          <w:color w:val="000000"/>
-        </w:rPr>
-        <w:t xml:space="preserve">when </w:t>
-      </w:r>
-      <w:proofErr w:type="spellStart"/>
-      <w:r>
-        <w:rPr>
-          <w:color w:val="000000"/>
-        </w:rPr>
-        <w:t>can_sniffer.ino</w:t>
-      </w:r>
-      <w:proofErr w:type="spellEnd"/>
-      <w:r>
-        <w:rPr>
-          <w:color w:val="000000"/>
-        </w:rPr>
-        <w:t xml:space="preserve"> is loaded)</w:t>
-      </w:r>
-    </w:p>
-    <w:p/>
-    <w:p>
-      <w:pPr>
-        <w:pStyle w:val="Heading1"/>
-      </w:pPr>
-      <w:r>
-        <w:t>14</w:t>
-      </w:r>
-      <w:proofErr w:type="gramStart"/>
-      <w:r>
-        <w:t>.  Troubleshooting</w:t>
-      </w:r>
-      <w:proofErr w:type="gramEnd"/>
-    </w:p>
-    <w:p>
-      <w:pPr>
-        <w:pStyle w:val="Heading2"/>
-      </w:pPr>
-      <w:r>
-        <w:t>No data / all gauges show --</w:t>
-      </w:r>
-    </w:p>
-    <w:p>
-      <w:pPr>
-        <w:spacing w:after="120"/>
-      </w:pPr>
-      <w:r>
-        <w:rPr>
-          <w:color w:val="000000"/>
-        </w:rPr>
-        <w:t>1</w:t>
-      </w:r>
-      <w:proofErr w:type="gramStart"/>
-      <w:r>
-        <w:rPr>
-          <w:color w:val="000000"/>
-        </w:rPr>
-        <w:t>.  Check</w:t>
-      </w:r>
-      <w:proofErr w:type="gramEnd"/>
-      <w:r>
-        <w:rPr>
-          <w:color w:val="000000"/>
-        </w:rPr>
-        <w:t xml:space="preserve"> Serial Monitor (115200 </w:t>
-      </w:r>
-      <w:proofErr w:type="gramStart"/>
-      <w:r>
-        <w:rPr>
-          <w:color w:val="000000"/>
-        </w:rPr>
-        <w:t>baud) —</w:t>
-      </w:r>
-      <w:proofErr w:type="gramEnd"/>
-      <w:r>
-        <w:rPr>
-          <w:color w:val="000000"/>
-        </w:rPr>
-        <w:t xml:space="preserve"> TWAI Init OK should appear</w:t>
-      </w:r>
-    </w:p>
-    <w:p>
-      <w:pPr>
-        <w:spacing w:after="120"/>
-      </w:pPr>
-      <w:r>
-        <w:rPr>
-          <w:color w:val="000000"/>
-        </w:rPr>
-        <w:t>2</w:t>
-      </w:r>
-      <w:proofErr w:type="gramStart"/>
-      <w:r>
-        <w:rPr>
-          <w:color w:val="000000"/>
-        </w:rPr>
-        <w:t>.  Verify</w:t>
-      </w:r>
-      <w:proofErr w:type="gramEnd"/>
-      <w:r>
-        <w:rPr>
-          <w:color w:val="000000"/>
-        </w:rPr>
-        <w:t xml:space="preserve"> CANH/CANL not swapped at CN5</w:t>
-      </w:r>
-    </w:p>
-    <w:p>
-      <w:pPr>
-        <w:spacing w:after="120"/>
-      </w:pPr>
-      <w:r>
-        <w:rPr>
-          <w:color w:val="000000"/>
-        </w:rPr>
-        <w:t>3</w:t>
-      </w:r>
-      <w:proofErr w:type="gramStart"/>
-      <w:r>
-        <w:rPr>
-          <w:color w:val="000000"/>
-        </w:rPr>
-        <w:t>.  Check</w:t>
-      </w:r>
-      <w:proofErr w:type="gramEnd"/>
-      <w:r>
-        <w:rPr>
-          <w:color w:val="000000"/>
-        </w:rPr>
-        <w:t xml:space="preserve"> JP1+JP2 jumper configuration vs </w:t>
-      </w:r>
-      <w:proofErr w:type="spellStart"/>
-      <w:r>
-        <w:rPr>
-          <w:color w:val="000000"/>
-        </w:rPr>
-        <w:t>ZombieVerter</w:t>
-      </w:r>
-      <w:proofErr w:type="spellEnd"/>
-      <w:r>
-        <w:rPr>
-          <w:color w:val="000000"/>
-        </w:rPr>
-        <w:t xml:space="preserve"> termination</w:t>
-      </w:r>
-    </w:p>
-    <w:p>
-      <w:pPr>
-        <w:spacing w:after="120"/>
-      </w:pPr>
-      <w:r>
-        <w:rPr>
-          <w:color w:val="000000"/>
-        </w:rPr>
-        <w:t xml:space="preserve">4.  Flash </w:t>
-      </w:r>
-      <w:proofErr w:type="spellStart"/>
-      <w:r>
-        <w:rPr>
-          <w:color w:val="000000"/>
-        </w:rPr>
-        <w:t>can_sniffer.ino</w:t>
-      </w:r>
-      <w:proofErr w:type="spellEnd"/>
-      <w:r>
-        <w:rPr>
-          <w:color w:val="000000"/>
-        </w:rPr>
-        <w:t xml:space="preserve"> — connect to </w:t>
-      </w:r>
-      <w:proofErr w:type="spellStart"/>
-      <w:r>
-        <w:rPr>
-          <w:color w:val="000000"/>
-        </w:rPr>
-        <w:t>CAN_Sniffer</w:t>
-      </w:r>
-      <w:proofErr w:type="spellEnd"/>
-      <w:r>
-        <w:rPr>
-          <w:color w:val="000000"/>
-        </w:rPr>
-        <w:t xml:space="preserve"> </w:t>
-      </w:r>
-      <w:proofErr w:type="spellStart"/>
-      <w:r>
-        <w:rPr>
-          <w:color w:val="000000"/>
-        </w:rPr>
-        <w:t>WiFi</w:t>
-      </w:r>
-      <w:proofErr w:type="spellEnd"/>
-      <w:r>
-        <w:rPr>
-          <w:color w:val="000000"/>
-        </w:rPr>
-        <w:t>, open http://192.168.4.1</w:t>
-      </w:r>
-    </w:p>
-    <w:p>
-      <w:pPr>
-        <w:spacing w:after="120"/>
-      </w:pPr>
-      <w:r>
-        <w:rPr>
-          <w:color w:val="000000"/>
-        </w:rPr>
-        <w:t>5</w:t>
-      </w:r>
-      <w:proofErr w:type="gramStart"/>
-      <w:r>
-        <w:rPr>
-          <w:color w:val="000000"/>
-        </w:rPr>
-        <w:t>.  If</w:t>
-      </w:r>
-      <w:proofErr w:type="gramEnd"/>
-      <w:r>
-        <w:rPr>
-          <w:color w:val="000000"/>
-        </w:rPr>
-        <w:t xml:space="preserve"> Total Frames = 0 → wiring or termination fault</w:t>
-      </w:r>
-    </w:p>
-    <w:p>
-      <w:pPr>
-        <w:spacing w:after="120"/>
-      </w:pPr>
-      <w:r>
-        <w:rPr>
-          <w:color w:val="000000"/>
-        </w:rPr>
-        <w:t>6</w:t>
-      </w:r>
-      <w:proofErr w:type="gramStart"/>
-      <w:r>
-        <w:rPr>
-          <w:color w:val="000000"/>
-        </w:rPr>
-        <w:t>.  If</w:t>
-      </w:r>
-      <w:proofErr w:type="gramEnd"/>
-      <w:r>
-        <w:rPr>
-          <w:color w:val="000000"/>
-        </w:rPr>
-        <w:t xml:space="preserve"> frames present but no 0x1DA/0x55A/0x55B → Leaf BMS not on CAN1 or wrong bus</w:t>
-      </w:r>
-    </w:p>
-    <w:p/>
-    <w:p>
-      <w:pPr>
-        <w:pStyle w:val="Heading2"/>
-      </w:pPr>
-      <w:r>
-        <w:t xml:space="preserve">Power LED off / no </w:t>
-      </w:r>
-      <w:proofErr w:type="spellStart"/>
-      <w:r>
-        <w:t>WiFi</w:t>
-      </w:r>
-      <w:proofErr w:type="spellEnd"/>
-      <w:r>
-        <w:t xml:space="preserve"> AP</w:t>
-      </w:r>
-    </w:p>
-    <w:p>
-      <w:pPr>
-        <w:spacing w:after="120"/>
-      </w:pPr>
-      <w:r>
-        <w:rPr>
-          <w:color w:val="000000"/>
-        </w:rPr>
-        <w:t>1</w:t>
-      </w:r>
-      <w:proofErr w:type="gramStart"/>
-      <w:r>
-        <w:rPr>
-          <w:color w:val="000000"/>
-        </w:rPr>
-        <w:t>.  Check</w:t>
-      </w:r>
-      <w:proofErr w:type="gramEnd"/>
-      <w:r>
-        <w:rPr>
-          <w:color w:val="000000"/>
-        </w:rPr>
-        <w:t xml:space="preserve"> 24V supply at CN4 and fuse FH1</w:t>
-      </w:r>
-    </w:p>
-    <w:p>
-      <w:pPr>
-        <w:spacing w:after="120"/>
-      </w:pPr>
-      <w:r>
-        <w:rPr>
-          <w:color w:val="000000"/>
-        </w:rPr>
-        <w:t>2</w:t>
-      </w:r>
-      <w:proofErr w:type="gramStart"/>
-      <w:r>
-        <w:rPr>
-          <w:color w:val="000000"/>
-        </w:rPr>
-        <w:t>.  Try</w:t>
-      </w:r>
-      <w:proofErr w:type="gramEnd"/>
-      <w:r>
-        <w:rPr>
-          <w:color w:val="000000"/>
-        </w:rPr>
-        <w:t xml:space="preserve"> USB-C alone — if </w:t>
-      </w:r>
-      <w:proofErr w:type="spellStart"/>
-      <w:r>
-        <w:rPr>
-          <w:color w:val="000000"/>
-        </w:rPr>
-        <w:t>WiFi</w:t>
-      </w:r>
-      <w:proofErr w:type="spellEnd"/>
-      <w:r>
-        <w:rPr>
-          <w:color w:val="000000"/>
-        </w:rPr>
-        <w:t xml:space="preserve"> appears, 24V supply is the issue</w:t>
-      </w:r>
-    </w:p>
-    <w:p>
-      <w:pPr>
-        <w:spacing w:after="120"/>
-      </w:pPr>
-      <w:r>
-        <w:rPr>
-          <w:color w:val="000000"/>
-        </w:rPr>
-        <w:t>3</w:t>
-      </w:r>
-      <w:proofErr w:type="gramStart"/>
-      <w:r>
-        <w:rPr>
-          <w:color w:val="000000"/>
-        </w:rPr>
-        <w:t>.  Check</w:t>
-      </w:r>
-      <w:proofErr w:type="gramEnd"/>
-      <w:r>
-        <w:rPr>
-          <w:color w:val="000000"/>
-        </w:rPr>
-        <w:t xml:space="preserve"> AP63205WU-7 output — should be 5.0V at H2 pin1</w:t>
-      </w:r>
-    </w:p>
-    <w:p/>
-    <w:p>
-      <w:pPr>
-        <w:pStyle w:val="Heading2"/>
-      </w:pPr>
-      <w:r>
-        <w:t>Upload fails via USB-C</w:t>
-      </w:r>
-    </w:p>
-    <w:p>
-      <w:pPr>
-        <w:spacing w:after="120"/>
-      </w:pPr>
-      <w:r>
-        <w:rPr>
-          <w:color w:val="000000"/>
-        </w:rPr>
-        <w:lastRenderedPageBreak/>
-        <w:t>1</w:t>
-      </w:r>
-      <w:proofErr w:type="gramStart"/>
-      <w:r>
-        <w:rPr>
-          <w:color w:val="000000"/>
-        </w:rPr>
-        <w:t>.  Install</w:t>
-      </w:r>
-      <w:proofErr w:type="gramEnd"/>
-      <w:r>
-        <w:rPr>
-          <w:color w:val="000000"/>
-        </w:rPr>
-        <w:t xml:space="preserve"> CH340 drivers if COM port </w:t>
-      </w:r>
-      <w:proofErr w:type="gramStart"/>
-      <w:r>
-        <w:rPr>
-          <w:color w:val="000000"/>
-        </w:rPr>
-        <w:t>not</w:t>
-      </w:r>
-      <w:proofErr w:type="gramEnd"/>
-      <w:r>
-        <w:rPr>
-          <w:color w:val="000000"/>
-        </w:rPr>
-        <w:t xml:space="preserve"> visible</w:t>
-      </w:r>
-    </w:p>
-    <w:p>
-      <w:pPr>
-        <w:spacing w:after="120"/>
-      </w:pPr>
-      <w:r>
-        <w:rPr>
-          <w:color w:val="000000"/>
-        </w:rPr>
-        <w:t>2</w:t>
-      </w:r>
-      <w:proofErr w:type="gramStart"/>
-      <w:r>
-        <w:rPr>
-          <w:color w:val="000000"/>
-        </w:rPr>
-        <w:t>.  Try</w:t>
-      </w:r>
-      <w:proofErr w:type="gramEnd"/>
-      <w:r>
-        <w:rPr>
-          <w:color w:val="000000"/>
-        </w:rPr>
-        <w:t xml:space="preserve"> manual bootloader mode (BOOT + RST)</w:t>
-      </w:r>
-    </w:p>
-    <w:p>
-      <w:pPr>
-        <w:spacing w:after="120"/>
-      </w:pPr>
-      <w:r>
-        <w:rPr>
-          <w:color w:val="000000"/>
-        </w:rPr>
-        <w:t>3</w:t>
-      </w:r>
-      <w:proofErr w:type="gramStart"/>
-      <w:r>
-        <w:rPr>
-          <w:color w:val="000000"/>
-        </w:rPr>
-        <w:t>.  Reduce</w:t>
-      </w:r>
-      <w:proofErr w:type="gramEnd"/>
-      <w:r>
-        <w:rPr>
-          <w:color w:val="000000"/>
-        </w:rPr>
-        <w:t xml:space="preserve"> upload speed to 460800 in Arduino IDE board settings</w:t>
-      </w:r>
-    </w:p>
-    <w:p/>
-    <w:p>
-      <w:pPr>
-        <w:pStyle w:val="Heading2"/>
-      </w:pPr>
-      <w:r>
-        <w:t>Known code issues (current version)</w:t>
-      </w:r>
-    </w:p>
-    <w:p>
-      <w:pPr>
-        <w:spacing w:after="120"/>
-      </w:pPr>
-      <w:proofErr w:type="gramStart"/>
-      <w:r>
-        <w:rPr>
-          <w:b/>
-          <w:bCs/>
-          <w:color w:val="C00000"/>
-          <w:sz w:val="20"/>
-          <w:szCs w:val="20"/>
-        </w:rPr>
-        <w:t xml:space="preserve">⚠  </w:t>
-      </w:r>
-      <w:proofErr w:type="spellStart"/>
-      <w:r>
-        <w:rPr>
-          <w:b/>
-          <w:bCs/>
-          <w:color w:val="C00000"/>
-          <w:sz w:val="20"/>
-          <w:szCs w:val="20"/>
-        </w:rPr>
-        <w:t>diagnosticpage</w:t>
-      </w:r>
-      <w:proofErr w:type="gramEnd"/>
-      <w:r>
-        <w:rPr>
-          <w:b/>
-          <w:bCs/>
-          <w:color w:val="C00000"/>
-          <w:sz w:val="20"/>
-          <w:szCs w:val="20"/>
-        </w:rPr>
-        <w:t>.h</w:t>
-      </w:r>
-      <w:proofErr w:type="spellEnd"/>
-      <w:r>
-        <w:rPr>
-          <w:b/>
-          <w:bCs/>
-          <w:color w:val="C00000"/>
-          <w:sz w:val="20"/>
-          <w:szCs w:val="20"/>
-        </w:rPr>
-        <w:t xml:space="preserve"> has duplicate id='</w:t>
-      </w:r>
-      <w:proofErr w:type="spellStart"/>
-      <w:r>
-        <w:rPr>
-          <w:b/>
-          <w:bCs/>
-          <w:color w:val="C00000"/>
-          <w:sz w:val="20"/>
-          <w:szCs w:val="20"/>
-        </w:rPr>
-        <w:t>stateofcharge</w:t>
-      </w:r>
-      <w:proofErr w:type="spellEnd"/>
-      <w:r>
-        <w:rPr>
-          <w:b/>
-          <w:bCs/>
-          <w:color w:val="C00000"/>
-          <w:sz w:val="20"/>
-          <w:szCs w:val="20"/>
-        </w:rPr>
-        <w:t xml:space="preserve">' and duplicate id='error' — second instance will not update in some browsers. Remove duplicate </w:t>
-      </w:r>
-      <w:proofErr w:type="spellStart"/>
-      <w:r>
-        <w:rPr>
-          <w:b/>
-          <w:bCs/>
-          <w:color w:val="C00000"/>
-          <w:sz w:val="20"/>
-          <w:szCs w:val="20"/>
-        </w:rPr>
-        <w:t>divs</w:t>
-      </w:r>
-      <w:proofErr w:type="spellEnd"/>
-      <w:r>
-        <w:rPr>
-          <w:b/>
-          <w:bCs/>
-          <w:color w:val="C00000"/>
-          <w:sz w:val="20"/>
-          <w:szCs w:val="20"/>
-        </w:rPr>
-        <w:t>.</w:t>
-      </w:r>
-    </w:p>
-    <w:p>
-      <w:pPr>
-        <w:spacing w:after="120"/>
-      </w:pPr>
-      <w:proofErr w:type="gramStart"/>
-      <w:r>
-        <w:rPr>
-          <w:b/>
-          <w:bCs/>
-          <w:color w:val="C00000"/>
-          <w:sz w:val="20"/>
-          <w:szCs w:val="20"/>
-        </w:rPr>
-        <w:t xml:space="preserve">⚠  </w:t>
-      </w:r>
-      <w:proofErr w:type="spellStart"/>
-      <w:r>
-        <w:rPr>
-          <w:b/>
-          <w:bCs/>
-          <w:color w:val="C00000"/>
-          <w:sz w:val="20"/>
-          <w:szCs w:val="20"/>
-        </w:rPr>
-        <w:t>driverpage</w:t>
-      </w:r>
-      <w:proofErr w:type="gramEnd"/>
-      <w:r>
-        <w:rPr>
-          <w:b/>
-          <w:bCs/>
-          <w:color w:val="C00000"/>
-          <w:sz w:val="20"/>
-          <w:szCs w:val="20"/>
-        </w:rPr>
-        <w:t>.h</w:t>
-      </w:r>
-      <w:proofErr w:type="spellEnd"/>
-      <w:r>
-        <w:rPr>
-          <w:b/>
-          <w:bCs/>
-          <w:color w:val="C00000"/>
-          <w:sz w:val="20"/>
-          <w:szCs w:val="20"/>
-        </w:rPr>
-        <w:t xml:space="preserve"> catch block references bare '</w:t>
-      </w:r>
-      <w:proofErr w:type="spellStart"/>
-      <w:r>
-        <w:rPr>
-          <w:b/>
-          <w:bCs/>
-          <w:color w:val="C00000"/>
-          <w:sz w:val="20"/>
-          <w:szCs w:val="20"/>
-        </w:rPr>
-        <w:t>opmode</w:t>
-      </w:r>
-      <w:proofErr w:type="spellEnd"/>
-      <w:r>
-        <w:rPr>
-          <w:b/>
-          <w:bCs/>
-          <w:color w:val="C00000"/>
-          <w:sz w:val="20"/>
-          <w:szCs w:val="20"/>
-        </w:rPr>
-        <w:t xml:space="preserve">' identifier — will throw </w:t>
-      </w:r>
-      <w:proofErr w:type="spellStart"/>
-      <w:r>
-        <w:rPr>
-          <w:b/>
-          <w:bCs/>
-          <w:color w:val="C00000"/>
-          <w:sz w:val="20"/>
-          <w:szCs w:val="20"/>
-        </w:rPr>
-        <w:t>ReferenceError</w:t>
-      </w:r>
-      <w:proofErr w:type="spellEnd"/>
-      <w:r>
-        <w:rPr>
-          <w:b/>
-          <w:bCs/>
-          <w:color w:val="C00000"/>
-          <w:sz w:val="20"/>
-          <w:szCs w:val="20"/>
-        </w:rPr>
-        <w:t>. Remove '</w:t>
-      </w:r>
-      <w:proofErr w:type="spellStart"/>
-      <w:r>
-        <w:rPr>
-          <w:b/>
-          <w:bCs/>
-          <w:color w:val="C00000"/>
-          <w:sz w:val="20"/>
-          <w:szCs w:val="20"/>
-        </w:rPr>
-        <w:t>opmode</w:t>
-      </w:r>
-      <w:proofErr w:type="spellEnd"/>
-      <w:r>
-        <w:rPr>
-          <w:b/>
-          <w:bCs/>
-          <w:color w:val="C00000"/>
-          <w:sz w:val="20"/>
-          <w:szCs w:val="20"/>
-        </w:rPr>
-        <w:t>' from the catch line.</w:t>
-      </w:r>
-    </w:p>
-    <w:p>
-      <w:pPr>
-        <w:spacing w:after="120"/>
-      </w:pPr>
-      <w:proofErr w:type="gramStart"/>
       <w:r>
         <w:rPr>
           <w:color w:val="375623"/>
           <w:sz w:val="20"/>
           <w:szCs w:val="20"/>
         </w:rPr>
-        <w:t>✔  Both</w:t>
-      </w:r>
-      <w:proofErr w:type="gramEnd"/>
-      <w:r>
-        <w:rPr>
-          <w:color w:val="375623"/>
-          <w:sz w:val="20"/>
-          <w:szCs w:val="20"/>
-        </w:rPr>
-        <w:t xml:space="preserve"> issues are cosmetic — dashboard functions correctly despite them.</w:t>
+        <w:t>✔  Both issues are cosmetic — dashboard functions correctly despite them.</w:t>
       </w:r>
     </w:p>
     <w:p/>
@@ -11516,139 +9142,7 @@
           <w:sz w:val="16"/>
           <w:szCs w:val="16"/>
         </w:rPr>
-        <w:t xml:space="preserve">Angry Pixie </w:t>
-      </w:r>
-      <w:proofErr w:type="gramStart"/>
-      <w:r>
-        <w:rPr>
-          <w:i/>
-          <w:iCs/>
-          <w:color w:val="808080"/>
-          <w:sz w:val="16"/>
-          <w:szCs w:val="16"/>
-        </w:rPr>
-        <w:t>Garage  ·</w:t>
-      </w:r>
-      <w:proofErr w:type="gramEnd"/>
-      <w:r>
-        <w:rPr>
-          <w:i/>
-          <w:iCs/>
-          <w:color w:val="808080"/>
-          <w:sz w:val="16"/>
-          <w:szCs w:val="16"/>
-        </w:rPr>
-        <w:t xml:space="preserve">  </w:t>
-      </w:r>
-      <w:proofErr w:type="gramStart"/>
-      <w:r>
-        <w:rPr>
-          <w:i/>
-          <w:iCs/>
-          <w:color w:val="808080"/>
-          <w:sz w:val="16"/>
-          <w:szCs w:val="16"/>
-        </w:rPr>
-        <w:t>www.theangrypixiegarage.com  ·</w:t>
-      </w:r>
-      <w:proofErr w:type="gramEnd"/>
-      <w:r>
-        <w:rPr>
-          <w:i/>
-          <w:iCs/>
-          <w:color w:val="808080"/>
-          <w:sz w:val="16"/>
-          <w:szCs w:val="16"/>
-        </w:rPr>
-        <w:t xml:space="preserve">  Porsche 928 </w:t>
-      </w:r>
-      <w:proofErr w:type="gramStart"/>
-      <w:r>
-        <w:rPr>
-          <w:i/>
-          <w:iCs/>
-          <w:color w:val="808080"/>
-          <w:sz w:val="16"/>
-          <w:szCs w:val="16"/>
-        </w:rPr>
-        <w:t>EV  ·</w:t>
-      </w:r>
-      <w:proofErr w:type="gramEnd"/>
-      <w:r>
-        <w:rPr>
-          <w:i/>
-          <w:iCs/>
-          <w:color w:val="808080"/>
-          <w:sz w:val="16"/>
-          <w:szCs w:val="16"/>
-        </w:rPr>
-        <w:t xml:space="preserve">  </w:t>
-      </w:r>
-      <w:proofErr w:type="spellStart"/>
-      <w:r>
-        <w:rPr>
-          <w:i/>
-          <w:iCs/>
-          <w:color w:val="808080"/>
-          <w:sz w:val="16"/>
-          <w:szCs w:val="16"/>
-        </w:rPr>
-        <w:t>ZombieVerter</w:t>
-      </w:r>
-      <w:proofErr w:type="spellEnd"/>
-      <w:r>
-        <w:rPr>
-          <w:i/>
-          <w:iCs/>
-          <w:color w:val="808080"/>
-          <w:sz w:val="16"/>
-          <w:szCs w:val="16"/>
-        </w:rPr>
-        <w:t xml:space="preserve"> </w:t>
-      </w:r>
-      <w:proofErr w:type="gramStart"/>
-      <w:r>
-        <w:rPr>
-          <w:i/>
-          <w:iCs/>
-          <w:color w:val="808080"/>
-          <w:sz w:val="16"/>
-          <w:szCs w:val="16"/>
-        </w:rPr>
-        <w:t>2.3  ·</w:t>
-      </w:r>
-      <w:proofErr w:type="gramEnd"/>
-      <w:r>
-        <w:rPr>
-          <w:i/>
-          <w:iCs/>
-          <w:color w:val="808080"/>
-          <w:sz w:val="16"/>
-          <w:szCs w:val="16"/>
-        </w:rPr>
-        <w:t xml:space="preserve">  </w:t>
-      </w:r>
-      <w:proofErr w:type="spellStart"/>
-      <w:r>
-        <w:rPr>
-          <w:i/>
-          <w:iCs/>
-          <w:color w:val="808080"/>
-          <w:sz w:val="16"/>
-          <w:szCs w:val="16"/>
-        </w:rPr>
-        <w:t>Uniboard</w:t>
-      </w:r>
-      <w:proofErr w:type="spellEnd"/>
-      <w:r>
-        <w:rPr>
-          <w:i/>
-          <w:iCs/>
-          <w:color w:val="808080"/>
-          <w:sz w:val="16"/>
-          <w:szCs w:val="16"/>
-        </w:rPr>
-        <w:t xml:space="preserve"> Rev 1.0</w:t>
+        <w:t>Angry Pixie Garage  ·  www.theangrypixiegarage.com  ·  Porsche 928 EV  ·  ZombieVerter 2.3  ·  Uniboard Rev 1.0</w:t>
       </w:r>
     </w:p>
     <w:sectPr>

</xml_diff>